<commit_message>
doc: layout adjusted + render issues + docker update
</commit_message>
<xml_diff>
--- a/docs/index.docx
+++ b/docs/index.docx
@@ -146,17 +146,16 @@
         <w:tblStyle w:val="Table"/>
         <w:tblLook w:firstRow="0" w:lastRow="0" w:firstColumn="0" w:lastColumn="0" w:noHBand="0" w:noVBand="0" w:val="0000"/>
         <w:tblBorders>
+          <w:top w:val="single" w:sz="4" w:space="0" w:color="CC1914"/>
           <w:left w:val="single" w:sz="24" w:space="0" w:color="CC1914"/>
+          <w:bottom w:val="single" w:sz="4" w:space="0" w:color="CC1914"/>
           <w:right w:val="single" w:sz="4" w:space="0" w:color="CC1914"/>
-          <w:top w:val="single" w:sz="4" w:space="0" w:color="CC1914"/>
-          <w:bottom w:val="single" w:sz="4" w:space="0" w:color="CC1914"/>
         </w:tblBorders>
         <w:tblCellMar>
           <w:left w:w="144" w:type="dxa"/>
           <w:right w:w="144" w:type="dxa"/>
         </w:tblCellMar>
-        <w:tblInd w:w="164" w:type="dxa"/>
-        <w:tblW w:type="pct" w:w="100%"/>
+        <w:tblLook w:firstRow="0" w:lastRow="0" w:firstColumn="0" w:lastColumn="0" w:noHBand="0" w:noVBand="0" w:val="0000"/>
       </w:tblPr>
       <w:tr>
         <w:trPr>
@@ -298,11 +297,12 @@
               <w:t xml:space="preserve">share the same content — the only difference is code visibility.</w:t>
             </w:r>
           </w:p>
+          <w:p/>
         </w:tc>
       </w:tr>
     </w:tbl>
     <w:bookmarkEnd w:id="24"/>
-    <w:bookmarkStart w:id="29" w:name="setup"/>
+    <w:bookmarkStart w:id="28" w:name="setup"/>
     <w:p>
       <w:pPr>
         <w:pStyle w:val="Heading2"/>
@@ -438,83 +438,30 @@
         <w:pStyle w:val="BodyText"/>
       </w:pPr>
       <w:r>
-        <w:rPr>
-          <w:vertAlign w:val="subscript"/>
-        </w:rPr>
-        <w:t xml:space="preserve">Source:</w:t>
-      </w:r>
-      <w:r>
-        <w:rPr>
-          <w:vertAlign w:val="subscript"/>
-        </w:rPr>
+        <w:t xml:space="preserve">We set global options and a seed for reproducibility. The seed ensures that all</w:t>
+      </w:r>
+      <w:r>
         <w:t xml:space="preserve"> </w:t>
       </w:r>
-      <w:hyperlink r:id="rId25">
-        <w:r>
-          <w:rPr>
-            <w:rStyle w:val="Hyperlink"/>
-            <w:vertAlign w:val="subscript"/>
-          </w:rPr>
-          <w:t xml:space="preserve">Article Notebook</w:t>
-        </w:r>
-      </w:hyperlink>
-    </w:p>
-    <w:p>
-      <w:pPr>
-        <w:pStyle w:val="BodyText"/>
-      </w:pPr>
-      <w:r>
-        <w:t xml:space="preserve">We set global options and a seed for reproducibility. The seed ensures that all</w:t>
-      </w:r>
-      <w:r>
-        <w:t xml:space="preserve"> </w:t>
-      </w:r>
       <w:r>
         <w:t xml:space="preserve">simulation-based results (power analysis) are exactly reproducible.</w:t>
       </w:r>
-    </w:p>
-    <w:p>
-      <w:pPr>
-        <w:pStyle w:val="BodyText"/>
-      </w:pPr>
-      <w:r>
-        <w:rPr>
-          <w:vertAlign w:val="subscript"/>
-        </w:rPr>
-        <w:t xml:space="preserve">Source:</w:t>
-      </w:r>
-      <w:r>
-        <w:rPr>
-          <w:vertAlign w:val="subscript"/>
-        </w:rPr>
-        <w:t xml:space="preserve"> </w:t>
-      </w:r>
-      <w:hyperlink r:id="rId25">
-        <w:r>
-          <w:rPr>
-            <w:rStyle w:val="Hyperlink"/>
-            <w:vertAlign w:val="subscript"/>
-          </w:rPr>
-          <w:t xml:space="preserve">Article Notebook</w:t>
-        </w:r>
-      </w:hyperlink>
     </w:p>
     <w:tbl>
       <w:tblPr>
         <w:tblStyle w:val="Table"/>
         <w:tblLook w:firstRow="0" w:lastRow="0" w:firstColumn="0" w:lastColumn="0" w:noHBand="0" w:noVBand="0" w:val="0000"/>
         <w:tblBorders>
+          <w:top w:val="single" w:sz="4" w:space="0" w:color="0758E5"/>
           <w:left w:val="single" w:sz="24" w:space="0" w:color="0758E5"/>
+          <w:bottom w:val="single" w:sz="4" w:space="0" w:color="0758E5"/>
           <w:right w:val="single" w:sz="4" w:space="0" w:color="0758E5"/>
-          <w:top w:val="single" w:sz="4" w:space="0" w:color="0758E5"/>
-          <w:bottom w:val="single" w:sz="4" w:space="0" w:color="0758E5"/>
         </w:tblBorders>
         <w:tblCellMar>
           <w:left w:w="144" w:type="dxa"/>
           <w:right w:w="144" w:type="dxa"/>
         </w:tblCellMar>
-        <w:tblInd w:w="164" w:type="dxa"/>
-        <w:tblW w:type="pct" w:w="100%"/>
+        <w:tblLook w:firstRow="0" w:lastRow="0" w:firstColumn="0" w:lastColumn="0" w:noHBand="0" w:noVBand="0" w:val="0000"/>
       </w:tblPr>
       <w:tr>
         <w:trPr>
@@ -541,18 +488,18 @@
                 <wp:inline>
                   <wp:extent cx="152400" cy="152400"/>
                   <wp:effectExtent b="0" l="0" r="0" t="0"/>
-                  <wp:docPr descr="" title="" id="27" name="Picture"/>
+                  <wp:docPr descr="" title="" id="26" name="Picture"/>
                   <a:graphic>
                     <a:graphicData uri="http://schemas.openxmlformats.org/drawingml/2006/picture">
                       <pic:pic>
                         <pic:nvPicPr>
-                          <pic:cNvPr descr="C:\Program Files\RStudio\resources\app\bin\quarto\share\formats\docx\note.png" id="28" name="Picture"/>
+                          <pic:cNvPr descr="C:\Program Files\RStudio\resources\app\bin\quarto\share\formats\docx\note.png" id="27" name="Picture"/>
                           <pic:cNvPicPr>
                             <a:picLocks noChangeArrowheads="1" noChangeAspect="1"/>
                           </pic:cNvPicPr>
                         </pic:nvPicPr>
                         <pic:blipFill>
-                          <a:blip r:embed="rId26"/>
+                          <a:blip r:embed="rId25"/>
                           <a:stretch>
                             <a:fillRect/>
                           </a:stretch>
@@ -726,11 +673,12 @@
               <w:t xml:space="preserve">scripts — this is, in fact, a best practice for reproducible research projects.</w:t>
             </w:r>
           </w:p>
+          <w:p/>
         </w:tc>
       </w:tr>
     </w:tbl>
-    <w:bookmarkEnd w:id="29"/>
-    <w:bookmarkStart w:id="34" w:name="sec-etl"/>
+    <w:bookmarkEnd w:id="28"/>
+    <w:bookmarkStart w:id="33" w:name="sec-etl"/>
     <w:p>
       <w:pPr>
         <w:pStyle w:val="Heading2"/>
@@ -785,32 +733,6 @@
       <w:r>
         <w:t xml:space="preserve">indicate better quality of life.</w:t>
       </w:r>
-    </w:p>
-    <w:p>
-      <w:pPr>
-        <w:pStyle w:val="BodyText"/>
-      </w:pPr>
-      <w:r>
-        <w:rPr>
-          <w:vertAlign w:val="subscript"/>
-        </w:rPr>
-        <w:t xml:space="preserve">Source:</w:t>
-      </w:r>
-      <w:r>
-        <w:rPr>
-          <w:vertAlign w:val="subscript"/>
-        </w:rPr>
-        <w:t xml:space="preserve"> </w:t>
-      </w:r>
-      <w:hyperlink r:id="rId25">
-        <w:r>
-          <w:rPr>
-            <w:rStyle w:val="Hyperlink"/>
-            <w:vertAlign w:val="subscript"/>
-          </w:rPr>
-          <w:t xml:space="preserve">Article Notebook</w:t>
-        </w:r>
-      </w:hyperlink>
     </w:p>
     <w:p>
       <w:pPr>
@@ -850,13 +772,13 @@
       <w:tr>
         <w:tc>
           <w:tcPr/>
-          <w:bookmarkStart w:id="30" w:name="tbl-data-head"/>
+          <w:bookmarkStart w:id="29" w:name="tbl-data-head"/>
           <w:p>
             <w:pPr>
               <w:jc w:val="center"/>
             </w:pPr>
             <w:pPr>
-              <w:jc w:val="start"/>
+              <w:jc w:val="left"/>
               <w:spacing w:before="200"/>
               <w:pStyle w:val="ImageCaption"/>
             </w:pPr>
@@ -3203,37 +3125,11 @@
               </w:tc>
             </w:tr>
           </w:tbl>
-          <w:bookmarkEnd w:id="30"/>
+          <w:bookmarkEnd w:id="29"/>
           <w:p/>
         </w:tc>
       </w:tr>
     </w:tbl>
-    <w:p>
-      <w:pPr>
-        <w:pStyle w:val="BodyText"/>
-      </w:pPr>
-      <w:r>
-        <w:rPr>
-          <w:vertAlign w:val="subscript"/>
-        </w:rPr>
-        <w:t xml:space="preserve">Source:</w:t>
-      </w:r>
-      <w:r>
-        <w:rPr>
-          <w:vertAlign w:val="subscript"/>
-        </w:rPr>
-        <w:t xml:space="preserve"> </w:t>
-      </w:r>
-      <w:hyperlink r:id="rId25">
-        <w:r>
-          <w:rPr>
-            <w:rStyle w:val="Hyperlink"/>
-            <w:vertAlign w:val="subscript"/>
-          </w:rPr>
-          <w:t xml:space="preserve">Article Notebook</w:t>
-        </w:r>
-      </w:hyperlink>
-    </w:p>
     <w:p>
       <w:pPr>
         <w:pStyle w:val="BodyText"/>
@@ -3305,13 +3201,13 @@
       <w:tr>
         <w:tc>
           <w:tcPr/>
-          <w:bookmarkStart w:id="31" w:name="tbl-descriptives"/>
+          <w:bookmarkStart w:id="30" w:name="tbl-descriptives"/>
           <w:p>
             <w:pPr>
               <w:jc w:val="center"/>
             </w:pPr>
             <w:pPr>
-              <w:jc w:val="start"/>
+              <w:jc w:val="left"/>
               <w:spacing w:before="200"/>
               <w:pStyle w:val="ImageCaption"/>
             </w:pPr>
@@ -7941,7 +7837,7 @@
               </w:tc>
             </w:tr>
           </w:tbl>
-          <w:bookmarkEnd w:id="31"/>
+          <w:bookmarkEnd w:id="30"/>
           <w:p/>
         </w:tc>
       </w:tr>
@@ -7951,32 +7847,6 @@
         <w:pStyle w:val="BodyText"/>
       </w:pPr>
       <w:r>
-        <w:rPr>
-          <w:vertAlign w:val="subscript"/>
-        </w:rPr>
-        <w:t xml:space="preserve">Source:</w:t>
-      </w:r>
-      <w:r>
-        <w:rPr>
-          <w:vertAlign w:val="subscript"/>
-        </w:rPr>
-        <w:t xml:space="preserve"> </w:t>
-      </w:r>
-      <w:hyperlink r:id="rId25">
-        <w:r>
-          <w:rPr>
-            <w:rStyle w:val="Hyperlink"/>
-            <w:vertAlign w:val="subscript"/>
-          </w:rPr>
-          <w:t xml:space="preserve">Article Notebook</w:t>
-        </w:r>
-      </w:hyperlink>
-    </w:p>
-    <w:p>
-      <w:pPr>
-        <w:pStyle w:val="BodyText"/>
-      </w:pPr>
-      <w:r>
         <w:t xml:space="preserve"> </w:t>
       </w:r>
     </w:p>
@@ -7985,17 +7855,16 @@
         <w:tblStyle w:val="Table"/>
         <w:tblLook w:firstRow="0" w:lastRow="0" w:firstColumn="0" w:lastColumn="0" w:noHBand="0" w:noVBand="0" w:val="0000"/>
         <w:tblBorders>
+          <w:top w:val="single" w:sz="4" w:space="0" w:color="0758E5"/>
           <w:left w:val="single" w:sz="24" w:space="0" w:color="0758E5"/>
+          <w:bottom w:val="single" w:sz="4" w:space="0" w:color="0758E5"/>
           <w:right w:val="single" w:sz="4" w:space="0" w:color="0758E5"/>
-          <w:top w:val="single" w:sz="4" w:space="0" w:color="0758E5"/>
-          <w:bottom w:val="single" w:sz="4" w:space="0" w:color="0758E5"/>
         </w:tblBorders>
         <w:tblCellMar>
           <w:left w:w="144" w:type="dxa"/>
           <w:right w:w="144" w:type="dxa"/>
         </w:tblCellMar>
-        <w:tblInd w:w="164" w:type="dxa"/>
-        <w:tblW w:type="pct" w:w="100%"/>
+        <w:tblLook w:firstRow="0" w:lastRow="0" w:firstColumn="0" w:lastColumn="0" w:noHBand="0" w:noVBand="0" w:val="0000"/>
       </w:tblPr>
       <w:tr>
         <w:trPr>
@@ -8022,18 +7891,18 @@
                 <wp:inline>
                   <wp:extent cx="152400" cy="152400"/>
                   <wp:effectExtent b="0" l="0" r="0" t="0"/>
-                  <wp:docPr descr="" title="" id="32" name="Picture"/>
+                  <wp:docPr descr="" title="" id="31" name="Picture"/>
                   <a:graphic>
                     <a:graphicData uri="http://schemas.openxmlformats.org/drawingml/2006/picture">
                       <pic:pic>
                         <pic:nvPicPr>
-                          <pic:cNvPr descr="C:\Program Files\RStudio\resources\app\bin\quarto\share\formats\docx\note.png" id="33" name="Picture"/>
+                          <pic:cNvPr descr="C:\Program Files\RStudio\resources\app\bin\quarto\share\formats\docx\note.png" id="32" name="Picture"/>
                           <pic:cNvPicPr>
                             <a:picLocks noChangeArrowheads="1" noChangeAspect="1"/>
                           </pic:cNvPicPr>
                         </pic:nvPicPr>
                         <pic:blipFill>
-                          <a:blip r:embed="rId26"/>
+                          <a:blip r:embed="rId25"/>
                           <a:stretch>
                             <a:fillRect/>
                           </a:stretch>
@@ -8111,11 +7980,12 @@
               <w:t xml:space="preserve">correlations and DWLS estimation rather than Pearson correlations and ML.</w:t>
             </w:r>
           </w:p>
+          <w:p/>
         </w:tc>
       </w:tr>
     </w:tbl>
-    <w:bookmarkEnd w:id="34"/>
-    <w:bookmarkStart w:id="47" w:name="sec-popmodel"/>
+    <w:bookmarkEnd w:id="33"/>
+    <w:bookmarkStart w:id="46" w:name="sec-popmodel"/>
     <w:p>
       <w:pPr>
         <w:pStyle w:val="Heading2"/>
@@ -8272,17 +8142,16 @@
         <w:tblStyle w:val="Table"/>
         <w:tblLook w:firstRow="0" w:lastRow="0" w:firstColumn="0" w:lastColumn="0" w:noHBand="0" w:noVBand="0" w:val="0000"/>
         <w:tblBorders>
+          <w:top w:val="single" w:sz="4" w:space="0" w:color="CC1914"/>
           <w:left w:val="single" w:sz="24" w:space="0" w:color="CC1914"/>
+          <w:bottom w:val="single" w:sz="4" w:space="0" w:color="CC1914"/>
           <w:right w:val="single" w:sz="4" w:space="0" w:color="CC1914"/>
-          <w:top w:val="single" w:sz="4" w:space="0" w:color="CC1914"/>
-          <w:bottom w:val="single" w:sz="4" w:space="0" w:color="CC1914"/>
         </w:tblBorders>
         <w:tblCellMar>
           <w:left w:w="144" w:type="dxa"/>
           <w:right w:w="144" w:type="dxa"/>
         </w:tblCellMar>
-        <w:tblInd w:w="164" w:type="dxa"/>
-        <w:tblW w:type="pct" w:w="100%"/>
+        <w:tblLook w:firstRow="0" w:lastRow="0" w:firstColumn="0" w:lastColumn="0" w:noHBand="0" w:noVBand="0" w:val="0000"/>
       </w:tblPr>
       <w:tr>
         <w:trPr>
@@ -8309,12 +8178,12 @@
                 <wp:inline>
                   <wp:extent cx="152400" cy="152400"/>
                   <wp:effectExtent b="0" l="0" r="0" t="0"/>
-                  <wp:docPr descr="" title="" id="35" name="Picture"/>
+                  <wp:docPr descr="" title="" id="34" name="Picture"/>
                   <a:graphic>
                     <a:graphicData uri="http://schemas.openxmlformats.org/drawingml/2006/picture">
                       <pic:pic>
                         <pic:nvPicPr>
-                          <pic:cNvPr descr="C:\Program Files\RStudio\resources\app\bin\quarto\share\formats\docx\important.png" id="36" name="Picture"/>
+                          <pic:cNvPr descr="C:\Program Files\RStudio\resources\app\bin\quarto\share\formats\docx\important.png" id="35" name="Picture"/>
                           <pic:cNvPicPr>
                             <a:picLocks noChangeArrowheads="1" noChangeAspect="1"/>
                           </pic:cNvPicPr>
@@ -8444,36 +8313,11 @@
               <w:t xml:space="preserve">appropriate starting values.</w:t>
             </w:r>
           </w:p>
+          <w:p/>
         </w:tc>
       </w:tr>
     </w:tbl>
-    <w:p>
-      <w:pPr>
-        <w:pStyle w:val="BodyText"/>
-      </w:pPr>
-      <w:r>
-        <w:rPr>
-          <w:vertAlign w:val="subscript"/>
-        </w:rPr>
-        <w:t xml:space="preserve">Source:</w:t>
-      </w:r>
-      <w:r>
-        <w:rPr>
-          <w:vertAlign w:val="subscript"/>
-        </w:rPr>
-        <w:t xml:space="preserve"> </w:t>
-      </w:r>
-      <w:hyperlink r:id="rId25">
-        <w:r>
-          <w:rPr>
-            <w:rStyle w:val="Hyperlink"/>
-            <w:vertAlign w:val="subscript"/>
-          </w:rPr>
-          <w:t xml:space="preserve">Article Notebook</w:t>
-        </w:r>
-      </w:hyperlink>
-    </w:p>
-    <w:bookmarkStart w:id="46" w:name="sec-dfi"/>
+    <w:bookmarkStart w:id="45" w:name="sec-dfi"/>
     <w:p>
       <w:pPr>
         <w:pStyle w:val="Heading3"/>
@@ -8717,18 +8561,18 @@
           <wp:inline>
             <wp:extent cx="4620126" cy="3696101"/>
             <wp:effectExtent b="0" l="0" r="0" t="0"/>
-            <wp:docPr descr="" title="" id="38" name="Picture"/>
+            <wp:docPr descr="" title="" id="37" name="Picture"/>
             <a:graphic>
               <a:graphicData uri="http://schemas.openxmlformats.org/drawingml/2006/picture">
                 <pic:pic>
                   <pic:nvPicPr>
-                    <pic:cNvPr descr="index_files/figure-docx/compute-dfi-1.png" id="39" name="Picture"/>
+                    <pic:cNvPr descr="index_files/figure-docx/compute-dfi-1.png" id="38" name="Picture"/>
                     <pic:cNvPicPr>
                       <a:picLocks noChangeArrowheads="1" noChangeAspect="1"/>
                     </pic:cNvPicPr>
                   </pic:nvPicPr>
                   <pic:blipFill>
-                    <a:blip r:embed="rId37"/>
+                    <a:blip r:embed="rId36"/>
                     <a:stretch>
                       <a:fillRect/>
                     </a:stretch>
@@ -8778,18 +8622,18 @@
           <wp:inline>
             <wp:extent cx="4620126" cy="3696101"/>
             <wp:effectExtent b="0" l="0" r="0" t="0"/>
-            <wp:docPr descr="" title="" id="41" name="Picture"/>
+            <wp:docPr descr="" title="" id="40" name="Picture"/>
             <a:graphic>
               <a:graphicData uri="http://schemas.openxmlformats.org/drawingml/2006/picture">
                 <pic:pic>
                   <pic:nvPicPr>
-                    <pic:cNvPr descr="index_files/figure-docx/compute-dfi-2.png" id="42" name="Picture"/>
+                    <pic:cNvPr descr="index_files/figure-docx/compute-dfi-2.png" id="41" name="Picture"/>
                     <pic:cNvPicPr>
                       <a:picLocks noChangeArrowheads="1" noChangeAspect="1"/>
                     </pic:cNvPicPr>
                   </pic:nvPicPr>
                   <pic:blipFill>
-                    <a:blip r:embed="rId40"/>
+                    <a:blip r:embed="rId39"/>
                     <a:stretch>
                       <a:fillRect/>
                     </a:stretch>
@@ -8839,18 +8683,18 @@
           <wp:inline>
             <wp:extent cx="4620126" cy="3696101"/>
             <wp:effectExtent b="0" l="0" r="0" t="0"/>
-            <wp:docPr descr="" title="" id="44" name="Picture"/>
+            <wp:docPr descr="" title="" id="43" name="Picture"/>
             <a:graphic>
               <a:graphicData uri="http://schemas.openxmlformats.org/drawingml/2006/picture">
                 <pic:pic>
                   <pic:nvPicPr>
-                    <pic:cNvPr descr="index_files/figure-docx/compute-dfi-3.png" id="45" name="Picture"/>
+                    <pic:cNvPr descr="index_files/figure-docx/compute-dfi-3.png" id="44" name="Picture"/>
                     <pic:cNvPicPr>
                       <a:picLocks noChangeArrowheads="1" noChangeAspect="1"/>
                     </pic:cNvPicPr>
                   </pic:nvPicPr>
                   <pic:blipFill>
-                    <a:blip r:embed="rId43"/>
+                    <a:blip r:embed="rId42"/>
                     <a:stretch>
                       <a:fillRect/>
                     </a:stretch>
@@ -8882,56 +8726,30 @@
         <w:pStyle w:val="BodyText"/>
       </w:pPr>
       <w:r>
-        <w:rPr>
-          <w:vertAlign w:val="subscript"/>
-        </w:rPr>
-        <w:t xml:space="preserve">Source:</w:t>
-      </w:r>
-      <w:r>
-        <w:rPr>
-          <w:vertAlign w:val="subscript"/>
-        </w:rPr>
+        <w:t xml:space="preserve">Note that we could compute a separate DFI for each estimated model (assuming</w:t>
+      </w:r>
+      <w:r>
         <w:t xml:space="preserve"> </w:t>
       </w:r>
-      <w:hyperlink r:id="rId25">
-        <w:r>
-          <w:rPr>
-            <w:rStyle w:val="Hyperlink"/>
-            <w:vertAlign w:val="subscript"/>
-          </w:rPr>
-          <w:t xml:space="preserve">Article Notebook</w:t>
-        </w:r>
-      </w:hyperlink>
+      <w:r>
+        <w:t xml:space="preserve">each in turn as the population model). However, this would sacrifice</w:t>
+      </w:r>
+      <w:r>
+        <w:t xml:space="preserve"> </w:t>
+      </w:r>
+      <w:r>
+        <w:t xml:space="preserve">comparability across models. Moreover, DFI methods for bifactor models are not</w:t>
+      </w:r>
+      <w:r>
+        <w:t xml:space="preserve"> </w:t>
+      </w:r>
+      <w:r>
+        <w:t xml:space="preserve">yet available, and those for hierarchical models are still in development.</w:t>
+      </w:r>
     </w:p>
-    <w:p>
-      <w:pPr>
-        <w:pStyle w:val="BodyText"/>
-      </w:pPr>
-      <w:r>
-        <w:t xml:space="preserve">Note that we could compute a separate DFI for each estimated model (assuming</w:t>
-      </w:r>
-      <w:r>
-        <w:t xml:space="preserve"> </w:t>
-      </w:r>
-      <w:r>
-        <w:t xml:space="preserve">each in turn as the population model). However, this would sacrifice</w:t>
-      </w:r>
-      <w:r>
-        <w:t xml:space="preserve"> </w:t>
-      </w:r>
-      <w:r>
-        <w:t xml:space="preserve">comparability across models. Moreover, DFI methods for bifactor models are not</w:t>
-      </w:r>
-      <w:r>
-        <w:t xml:space="preserve"> </w:t>
-      </w:r>
-      <w:r>
-        <w:t xml:space="preserve">yet available, and those for hierarchical models are still in development.</w:t>
-      </w:r>
-    </w:p>
+    <w:bookmarkEnd w:id="45"/>
     <w:bookmarkEnd w:id="46"/>
-    <w:bookmarkEnd w:id="47"/>
-    <w:bookmarkStart w:id="79" w:name="sec-4f"/>
+    <w:bookmarkStart w:id="78" w:name="sec-4f"/>
     <w:p>
       <w:pPr>
         <w:pStyle w:val="Heading2"/>
@@ -8963,7 +8781,7 @@
         <w:t xml:space="preserve">.</w:t>
       </w:r>
     </w:p>
-    <w:bookmarkStart w:id="48" w:name="model-specification"/>
+    <w:bookmarkStart w:id="47" w:name="model-specification"/>
     <w:p>
       <w:pPr>
         <w:pStyle w:val="Heading3"/>
@@ -9010,34 +8828,8 @@
         <w:t xml:space="preserve">related aspects within the Physical domain.</w:t>
       </w:r>
     </w:p>
-    <w:p>
-      <w:pPr>
-        <w:pStyle w:val="BodyText"/>
-      </w:pPr>
-      <w:r>
-        <w:rPr>
-          <w:vertAlign w:val="subscript"/>
-        </w:rPr>
-        <w:t xml:space="preserve">Source:</w:t>
-      </w:r>
-      <w:r>
-        <w:rPr>
-          <w:vertAlign w:val="subscript"/>
-        </w:rPr>
-        <w:t xml:space="preserve"> </w:t>
-      </w:r>
-      <w:hyperlink r:id="rId25">
-        <w:r>
-          <w:rPr>
-            <w:rStyle w:val="Hyperlink"/>
-            <w:vertAlign w:val="subscript"/>
-          </w:rPr>
-          <w:t xml:space="preserve">Article Notebook</w:t>
-        </w:r>
-      </w:hyperlink>
-    </w:p>
-    <w:bookmarkEnd w:id="48"/>
-    <w:bookmarkStart w:id="49" w:name="model-estimation"/>
+    <w:bookmarkEnd w:id="47"/>
+    <w:bookmarkStart w:id="48" w:name="model-estimation"/>
     <w:p>
       <w:pPr>
         <w:pStyle w:val="Heading3"/>
@@ -9084,34 +8876,8 @@
         <w:t xml:space="preserve">identification.</w:t>
       </w:r>
     </w:p>
-    <w:p>
-      <w:pPr>
-        <w:pStyle w:val="BodyText"/>
-      </w:pPr>
-      <w:r>
-        <w:rPr>
-          <w:vertAlign w:val="subscript"/>
-        </w:rPr>
-        <w:t xml:space="preserve">Source:</w:t>
-      </w:r>
-      <w:r>
-        <w:rPr>
-          <w:vertAlign w:val="subscript"/>
-        </w:rPr>
-        <w:t xml:space="preserve"> </w:t>
-      </w:r>
-      <w:hyperlink r:id="rId25">
-        <w:r>
-          <w:rPr>
-            <w:rStyle w:val="Hyperlink"/>
-            <w:vertAlign w:val="subscript"/>
-          </w:rPr>
-          <w:t xml:space="preserve">Article Notebook</w:t>
-        </w:r>
-      </w:hyperlink>
-    </w:p>
-    <w:bookmarkEnd w:id="49"/>
-    <w:bookmarkStart w:id="70" w:name="sec-eval-4f"/>
+    <w:bookmarkEnd w:id="48"/>
+    <w:bookmarkStart w:id="69" w:name="sec-eval-4f"/>
     <w:p>
       <w:pPr>
         <w:pStyle w:val="Heading3"/>
@@ -9125,17 +8891,16 @@
         <w:tblStyle w:val="Table"/>
         <w:tblLook w:firstRow="0" w:lastRow="0" w:firstColumn="0" w:lastColumn="0" w:noHBand="0" w:noVBand="0" w:val="0000"/>
         <w:tblBorders>
+          <w:top w:val="single" w:sz="4" w:space="0" w:color="00A047"/>
           <w:left w:val="single" w:sz="24" w:space="0" w:color="00A047"/>
+          <w:bottom w:val="single" w:sz="4" w:space="0" w:color="00A047"/>
           <w:right w:val="single" w:sz="4" w:space="0" w:color="00A047"/>
-          <w:top w:val="single" w:sz="4" w:space="0" w:color="00A047"/>
-          <w:bottom w:val="single" w:sz="4" w:space="0" w:color="00A047"/>
         </w:tblBorders>
         <w:tblCellMar>
           <w:left w:w="144" w:type="dxa"/>
           <w:right w:w="144" w:type="dxa"/>
         </w:tblCellMar>
-        <w:tblInd w:w="164" w:type="dxa"/>
-        <w:tblW w:type="pct" w:w="100%"/>
+        <w:tblLook w:firstRow="0" w:lastRow="0" w:firstColumn="0" w:lastColumn="0" w:noHBand="0" w:noVBand="0" w:val="0000"/>
       </w:tblPr>
       <w:tr>
         <w:trPr>
@@ -9162,18 +8927,18 @@
                 <wp:inline>
                   <wp:extent cx="152400" cy="152400"/>
                   <wp:effectExtent b="0" l="0" r="0" t="0"/>
-                  <wp:docPr descr="" title="" id="51" name="Picture"/>
+                  <wp:docPr descr="" title="" id="50" name="Picture"/>
                   <a:graphic>
                     <a:graphicData uri="http://schemas.openxmlformats.org/drawingml/2006/picture">
                       <pic:pic>
                         <pic:nvPicPr>
-                          <pic:cNvPr descr="C:\Program Files\RStudio\resources\app\bin\quarto\share\formats\docx\tip.png" id="52" name="Picture"/>
+                          <pic:cNvPr descr="C:\Program Files\RStudio\resources\app\bin\quarto\share\formats\docx\tip.png" id="51" name="Picture"/>
                           <pic:cNvPicPr>
                             <a:picLocks noChangeArrowheads="1" noChangeAspect="1"/>
                           </pic:cNvPicPr>
                         </pic:nvPicPr>
                         <pic:blipFill>
-                          <a:blip r:embed="rId50"/>
+                          <a:blip r:embed="rId49"/>
                           <a:stretch>
                             <a:fillRect/>
                           </a:stretch>
@@ -9339,6 +9104,7 @@
               <w:t xml:space="preserve">consistency.</w:t>
             </w:r>
           </w:p>
+          <w:p/>
         </w:tc>
       </w:tr>
     </w:tbl>
@@ -9355,13 +9121,13 @@
       <w:tr>
         <w:tc>
           <w:tcPr/>
-          <w:bookmarkStart w:id="53" w:name="tbl-fit-4fa"/>
+          <w:bookmarkStart w:id="52" w:name="tbl-fit-4fa"/>
           <w:p>
             <w:pPr>
               <w:jc w:val="center"/>
             </w:pPr>
             <w:pPr>
-              <w:jc w:val="start"/>
+              <w:jc w:val="left"/>
               <w:spacing w:before="200"/>
               <w:pStyle w:val="ImageCaption"/>
             </w:pPr>
@@ -9601,37 +9367,11 @@
               </w:tc>
             </w:tr>
           </w:tbl>
-          <w:bookmarkEnd w:id="53"/>
+          <w:bookmarkEnd w:id="52"/>
           <w:p/>
         </w:tc>
       </w:tr>
     </w:tbl>
-    <w:p>
-      <w:pPr>
-        <w:pStyle w:val="BodyText"/>
-      </w:pPr>
-      <w:r>
-        <w:rPr>
-          <w:vertAlign w:val="subscript"/>
-        </w:rPr>
-        <w:t xml:space="preserve">Source:</w:t>
-      </w:r>
-      <w:r>
-        <w:rPr>
-          <w:vertAlign w:val="subscript"/>
-        </w:rPr>
-        <w:t xml:space="preserve"> </w:t>
-      </w:r>
-      <w:hyperlink r:id="rId25">
-        <w:r>
-          <w:rPr>
-            <w:rStyle w:val="Hyperlink"/>
-            <w:vertAlign w:val="subscript"/>
-          </w:rPr>
-          <w:t xml:space="preserve">Article Notebook</w:t>
-        </w:r>
-      </w:hyperlink>
-    </w:p>
     <w:p>
       <w:pPr>
         <w:pStyle w:val="BodyText"/>
@@ -9653,13 +9393,13 @@
       <w:tr>
         <w:tc>
           <w:tcPr/>
-          <w:bookmarkStart w:id="54" w:name="tbl-loadings-4fa"/>
+          <w:bookmarkStart w:id="53" w:name="tbl-loadings-4fa"/>
           <w:p>
             <w:pPr>
               <w:jc w:val="center"/>
             </w:pPr>
             <w:pPr>
-              <w:jc w:val="start"/>
+              <w:jc w:val="left"/>
               <w:spacing w:before="200"/>
               <w:pStyle w:val="ImageCaption"/>
             </w:pPr>
@@ -11359,37 +11099,11 @@
               </w:tc>
             </w:tr>
           </w:tbl>
-          <w:bookmarkEnd w:id="54"/>
+          <w:bookmarkEnd w:id="53"/>
           <w:p/>
         </w:tc>
       </w:tr>
     </w:tbl>
-    <w:p>
-      <w:pPr>
-        <w:pStyle w:val="BodyText"/>
-      </w:pPr>
-      <w:r>
-        <w:rPr>
-          <w:vertAlign w:val="subscript"/>
-        </w:rPr>
-        <w:t xml:space="preserve">Source:</w:t>
-      </w:r>
-      <w:r>
-        <w:rPr>
-          <w:vertAlign w:val="subscript"/>
-        </w:rPr>
-        <w:t xml:space="preserve"> </w:t>
-      </w:r>
-      <w:hyperlink r:id="rId25">
-        <w:r>
-          <w:rPr>
-            <w:rStyle w:val="Hyperlink"/>
-            <w:vertAlign w:val="subscript"/>
-          </w:rPr>
-          <w:t xml:space="preserve">Article Notebook</w:t>
-        </w:r>
-      </w:hyperlink>
-    </w:p>
     <w:p>
       <w:pPr>
         <w:pStyle w:val="BodyText"/>
@@ -11411,13 +11125,13 @@
       <w:tr>
         <w:tc>
           <w:tcPr/>
-          <w:bookmarkStart w:id="55" w:name="tbl-cor-4fa"/>
+          <w:bookmarkStart w:id="54" w:name="tbl-cor-4fa"/>
           <w:p>
             <w:pPr>
               <w:jc w:val="center"/>
             </w:pPr>
             <w:pPr>
-              <w:jc w:val="start"/>
+              <w:jc w:val="left"/>
               <w:spacing w:before="200"/>
               <w:pStyle w:val="ImageCaption"/>
             </w:pPr>
@@ -11911,7 +11625,7 @@
               </w:tc>
             </w:tr>
           </w:tbl>
-          <w:bookmarkEnd w:id="55"/>
+          <w:bookmarkEnd w:id="54"/>
           <w:p/>
         </w:tc>
       </w:tr>
@@ -11921,104 +11635,78 @@
         <w:pStyle w:val="BodyText"/>
       </w:pPr>
       <w:r>
-        <w:rPr>
-          <w:vertAlign w:val="subscript"/>
-        </w:rPr>
-        <w:t xml:space="preserve">Source:</w:t>
-      </w:r>
-      <w:r>
-        <w:rPr>
-          <w:vertAlign w:val="subscript"/>
-        </w:rPr>
+        <w:t xml:space="preserve">Examining the output, the scaled chi-square test is statistically significant</w:t>
+      </w:r>
+      <w:r>
         <w:t xml:space="preserve"> </w:t>
       </w:r>
-      <w:hyperlink r:id="rId25">
-        <w:r>
-          <w:rPr>
-            <w:rStyle w:val="Hyperlink"/>
-            <w:vertAlign w:val="subscript"/>
-          </w:rPr>
-          <w:t xml:space="preserve">Article Notebook</w:t>
-        </w:r>
-      </w:hyperlink>
+      <w:r>
+        <w:t xml:space="preserve">(expected for large N), but this alone is not informative for model evaluation.</w:t>
+      </w:r>
+      <w:r>
+        <w:t xml:space="preserve"> </w:t>
+      </w:r>
+      <w:r>
+        <w:t xml:space="preserve">The scaled fit indices reveal a mediocre fit: the CFI and TLI values fall</w:t>
+      </w:r>
+      <w:r>
+        <w:t xml:space="preserve"> </w:t>
+      </w:r>
+      <w:r>
+        <w:t xml:space="preserve">slightly below the conventional .95 threshold, and the RMSEA exceeds .06. The</w:t>
+      </w:r>
+      <w:r>
+        <w:t xml:space="preserve"> </w:t>
+      </w:r>
+      <w:r>
+        <w:t xml:space="preserve">SRMR is within acceptable range. This pattern is consistent with a Level 2</w:t>
+      </w:r>
+      <w:r>
+        <w:t xml:space="preserve"> </w:t>
+      </w:r>
+      <w:r>
+        <w:t xml:space="preserve">misspecification according to DFI standards — the model captures the general</w:t>
+      </w:r>
+      <w:r>
+        <w:t xml:space="preserve"> </w:t>
+      </w:r>
+      <w:r>
+        <w:t xml:space="preserve">structure but has notable local misfits.</w:t>
+      </w:r>
     </w:p>
     <w:p>
       <w:pPr>
         <w:pStyle w:val="BodyText"/>
       </w:pPr>
       <w:r>
-        <w:t xml:space="preserve">Examining the output, the scaled chi-square test is statistically significant</w:t>
+        <w:t xml:space="preserve">Regarding factor loadings, most items show adequate standardized loadings</w:t>
       </w:r>
       <w:r>
         <w:t xml:space="preserve"> </w:t>
       </w:r>
       <w:r>
-        <w:t xml:space="preserve">(expected for large N), but this alone is not informative for model evaluation.</w:t>
+        <w:t xml:space="preserve">(Std.all &gt; .50), indicating substantial association with their respective</w:t>
       </w:r>
       <w:r>
         <w:t xml:space="preserve"> </w:t>
       </w:r>
       <w:r>
-        <w:t xml:space="preserve">The scaled fit indices reveal a mediocre fit: the CFI and TLI values fall</w:t>
+        <w:t xml:space="preserve">factors. However, Q4 (Physical) shows a relatively lower loading, and the</w:t>
       </w:r>
       <w:r>
         <w:t xml:space="preserve"> </w:t>
       </w:r>
       <w:r>
-        <w:t xml:space="preserve">slightly below the conventional .95 threshold, and the RMSEA exceeds .06. The</w:t>
+        <w:t xml:space="preserve">R² values for Q4 (Physical) and Q24 (Environment) are notably low, suggesting</w:t>
       </w:r>
       <w:r>
         <w:t xml:space="preserve"> </w:t>
       </w:r>
       <w:r>
-        <w:t xml:space="preserve">SRMR is within acceptable range. This pattern is consistent with a Level 2</w:t>
-      </w:r>
-      <w:r>
-        <w:t xml:space="preserve"> </w:t>
-      </w:r>
-      <w:r>
-        <w:t xml:space="preserve">misspecification according to DFI standards — the model captures the general</w:t>
-      </w:r>
-      <w:r>
-        <w:t xml:space="preserve"> </w:t>
-      </w:r>
-      <w:r>
-        <w:t xml:space="preserve">structure but has notable local misfits.</w:t>
+        <w:t xml:space="preserve">these items are not well-explained by their assigned factor.</w:t>
       </w:r>
     </w:p>
-    <w:p>
-      <w:pPr>
-        <w:pStyle w:val="BodyText"/>
-      </w:pPr>
-      <w:r>
-        <w:t xml:space="preserve">Regarding factor loadings, most items show adequate standardized loadings</w:t>
-      </w:r>
-      <w:r>
-        <w:t xml:space="preserve"> </w:t>
-      </w:r>
-      <w:r>
-        <w:t xml:space="preserve">(Std.all &gt; .50), indicating substantial association with their respective</w:t>
-      </w:r>
-      <w:r>
-        <w:t xml:space="preserve"> </w:t>
-      </w:r>
-      <w:r>
-        <w:t xml:space="preserve">factors. However, Q4 (Physical) shows a relatively lower loading, and the</w:t>
-      </w:r>
-      <w:r>
-        <w:t xml:space="preserve"> </w:t>
-      </w:r>
-      <w:r>
-        <w:t xml:space="preserve">R² values for Q4 (Physical) and Q24 (Environment) are notably low, suggesting</w:t>
-      </w:r>
-      <w:r>
-        <w:t xml:space="preserve"> </w:t>
-      </w:r>
-      <w:r>
-        <w:t xml:space="preserve">these items are not well-explained by their assigned factor.</w:t>
-      </w:r>
-    </w:p>
-    <w:bookmarkStart w:id="60" w:name="modification-indices"/>
+    <w:bookmarkStart w:id="59" w:name="modification-indices"/>
     <w:p>
       <w:pPr>
         <w:pStyle w:val="Heading4"/>
@@ -12072,13 +11760,13 @@
       <w:tr>
         <w:tc>
           <w:tcPr/>
-          <w:bookmarkStart w:id="56" w:name="tbl-mi-4f"/>
+          <w:bookmarkStart w:id="55" w:name="tbl-mi-4f"/>
           <w:p>
             <w:pPr>
               <w:jc w:val="center"/>
             </w:pPr>
             <w:pPr>
-              <w:jc w:val="start"/>
+              <w:jc w:val="left"/>
               <w:spacing w:before="200"/>
               <w:pStyle w:val="ImageCaption"/>
             </w:pPr>
@@ -13779,7 +13467,7 @@
               </w:tc>
             </w:tr>
           </w:tbl>
-          <w:bookmarkEnd w:id="56"/>
+          <w:bookmarkEnd w:id="55"/>
           <w:p/>
         </w:tc>
       </w:tr>
@@ -13789,32 +13477,6 @@
         <w:pStyle w:val="BodyText"/>
       </w:pPr>
       <w:r>
-        <w:rPr>
-          <w:vertAlign w:val="subscript"/>
-        </w:rPr>
-        <w:t xml:space="preserve">Source:</w:t>
-      </w:r>
-      <w:r>
-        <w:rPr>
-          <w:vertAlign w:val="subscript"/>
-        </w:rPr>
-        <w:t xml:space="preserve"> </w:t>
-      </w:r>
-      <w:hyperlink r:id="rId25">
-        <w:r>
-          <w:rPr>
-            <w:rStyle w:val="Hyperlink"/>
-            <w:vertAlign w:val="subscript"/>
-          </w:rPr>
-          <w:t xml:space="preserve">Article Notebook</w:t>
-        </w:r>
-      </w:hyperlink>
-    </w:p>
-    <w:p>
-      <w:pPr>
-        <w:pStyle w:val="BodyText"/>
-      </w:pPr>
-      <w:r>
         <w:t xml:space="preserve">The modification indices reveal a critical finding:</w:t>
       </w:r>
       <w:r>
@@ -13874,17 +13536,16 @@
         <w:tblStyle w:val="Table"/>
         <w:tblLook w:firstRow="0" w:lastRow="0" w:firstColumn="0" w:lastColumn="0" w:noHBand="0" w:noVBand="0" w:val="0000"/>
         <w:tblBorders>
+          <w:top w:val="single" w:sz="4" w:space="0" w:color="EB9113"/>
           <w:left w:val="single" w:sz="24" w:space="0" w:color="EB9113"/>
+          <w:bottom w:val="single" w:sz="4" w:space="0" w:color="EB9113"/>
           <w:right w:val="single" w:sz="4" w:space="0" w:color="EB9113"/>
-          <w:top w:val="single" w:sz="4" w:space="0" w:color="EB9113"/>
-          <w:bottom w:val="single" w:sz="4" w:space="0" w:color="EB9113"/>
         </w:tblBorders>
         <w:tblCellMar>
           <w:left w:w="144" w:type="dxa"/>
           <w:right w:w="144" w:type="dxa"/>
         </w:tblCellMar>
-        <w:tblInd w:w="164" w:type="dxa"/>
-        <w:tblW w:type="pct" w:w="100%"/>
+        <w:tblLook w:firstRow="0" w:lastRow="0" w:firstColumn="0" w:lastColumn="0" w:noHBand="0" w:noVBand="0" w:val="0000"/>
       </w:tblPr>
       <w:tr>
         <w:trPr>
@@ -13911,18 +13572,18 @@
                 <wp:inline>
                   <wp:extent cx="152400" cy="152400"/>
                   <wp:effectExtent b="0" l="0" r="0" t="0"/>
-                  <wp:docPr descr="" title="" id="58" name="Picture"/>
+                  <wp:docPr descr="" title="" id="57" name="Picture"/>
                   <a:graphic>
                     <a:graphicData uri="http://schemas.openxmlformats.org/drawingml/2006/picture">
                       <pic:pic>
                         <pic:nvPicPr>
-                          <pic:cNvPr descr="C:\Program Files\RStudio\resources\app\bin\quarto\share\formats\docx\warning.png" id="59" name="Picture"/>
+                          <pic:cNvPr descr="C:\Program Files\RStudio\resources\app\bin\quarto\share\formats\docx\warning.png" id="58" name="Picture"/>
                           <pic:cNvPicPr>
                             <a:picLocks noChangeArrowheads="1" noChangeAspect="1"/>
                           </pic:cNvPicPr>
                         </pic:nvPicPr>
                         <pic:blipFill>
-                          <a:blip r:embed="rId57"/>
+                          <a:blip r:embed="rId56"/>
                           <a:stretch>
                             <a:fillRect/>
                           </a:stretch>
@@ -14012,11 +13673,12 @@
               <w:t xml:space="preserve">model.</w:t>
             </w:r>
           </w:p>
+          <w:p/>
         </w:tc>
       </w:tr>
     </w:tbl>
-    <w:bookmarkEnd w:id="60"/>
-    <w:bookmarkStart w:id="66" w:name="residual-correlations"/>
+    <w:bookmarkEnd w:id="59"/>
+    <w:bookmarkStart w:id="65" w:name="residual-correlations"/>
     <w:p>
       <w:pPr>
         <w:pStyle w:val="Heading4"/>
@@ -14045,7 +13707,7 @@
         <w:t xml:space="preserve">show the discrepancies between model-implied and observed correlations.</w:t>
       </w:r>
     </w:p>
-    <w:bookmarkStart w:id="65" w:name="cell-fig-residuals-4f"/>
+    <w:bookmarkStart w:id="64" w:name="cell-fig-residuals-4f"/>
     <w:tbl>
       <w:tblPr>
         <w:tblStyle w:val="Table"/>
@@ -14059,7 +13721,7 @@
       <w:tr>
         <w:tc>
           <w:tcPr/>
-          <w:bookmarkStart w:id="64" w:name="fig-residuals-4f"/>
+          <w:bookmarkStart w:id="63" w:name="fig-residuals-4f"/>
           <w:p>
             <w:pPr>
               <w:pStyle w:val="Compact"/>
@@ -14070,18 +13732,18 @@
                 <wp:inline>
                   <wp:extent cx="5334000" cy="4667250"/>
                   <wp:effectExtent b="0" l="0" r="0" t="0"/>
-                  <wp:docPr descr="" title="" id="62" name="Picture"/>
+                  <wp:docPr descr="" title="" id="61" name="Picture"/>
                   <a:graphic>
                     <a:graphicData uri="http://schemas.openxmlformats.org/drawingml/2006/picture">
                       <pic:pic>
                         <pic:nvPicPr>
-                          <pic:cNvPr descr="index_files/figure-docx/fig-residuals-4f-1.png" id="63" name="Picture"/>
+                          <pic:cNvPr descr="index_files/figure-docx/fig-residuals-4f-1.png" id="62" name="Picture"/>
                           <pic:cNvPicPr>
                             <a:picLocks noChangeArrowheads="1" noChangeAspect="1"/>
                           </pic:cNvPicPr>
                         </pic:nvPicPr>
                         <pic:blipFill>
-                          <a:blip r:embed="rId61"/>
+                          <a:blip r:embed="rId60"/>
                           <a:stretch>
                             <a:fillRect/>
                           </a:stretch>
@@ -14113,7 +13775,7 @@
               <w:jc w:val="center"/>
             </w:pPr>
             <w:pPr>
-              <w:jc w:val="start"/>
+              <w:jc w:val="left"/>
               <w:spacing w:before="200"/>
               <w:pStyle w:val="ImageCaption"/>
             </w:pPr>
@@ -14121,37 +13783,11 @@
               <w:t xml:space="preserve">Figure 1: Heatmap of standardized residual correlations for the 4-factor model</w:t>
             </w:r>
           </w:p>
-          <w:bookmarkEnd w:id="64"/>
+          <w:bookmarkEnd w:id="63"/>
         </w:tc>
       </w:tr>
     </w:tbl>
-    <w:p>
-      <w:pPr>
-        <w:pStyle w:val="BodyText"/>
-      </w:pPr>
-      <w:r>
-        <w:rPr>
-          <w:vertAlign w:val="subscript"/>
-        </w:rPr>
-        <w:t xml:space="preserve">Source:</w:t>
-      </w:r>
-      <w:r>
-        <w:rPr>
-          <w:vertAlign w:val="subscript"/>
-        </w:rPr>
-        <w:t xml:space="preserve"> </w:t>
-      </w:r>
-      <w:hyperlink r:id="rId25">
-        <w:r>
-          <w:rPr>
-            <w:rStyle w:val="Hyperlink"/>
-            <w:vertAlign w:val="subscript"/>
-          </w:rPr>
-          <w:t xml:space="preserve">Article Notebook</w:t>
-        </w:r>
-      </w:hyperlink>
-    </w:p>
-    <w:bookmarkEnd w:id="65"/>
+    <w:bookmarkEnd w:id="64"/>
     <w:p>
       <w:pPr>
         <w:pStyle w:val="BodyText"/>
@@ -14179,8 +13815,8 @@
         <w:t xml:space="preserve">The residual analysis confirms the patterns identified by the modification indices: the largest standardized residuals involve Q5 and items from other domains, reinforcing the conclusion that this item introduces systematic misfit.</w:t>
       </w:r>
     </w:p>
-    <w:bookmarkEnd w:id="66"/>
-    <w:bookmarkStart w:id="68" w:name="reliability-coefficients"/>
+    <w:bookmarkEnd w:id="65"/>
+    <w:bookmarkStart w:id="67" w:name="reliability-coefficients"/>
     <w:p>
       <w:pPr>
         <w:pStyle w:val="Heading4"/>
@@ -14246,13 +13882,13 @@
       <w:tr>
         <w:tc>
           <w:tcPr/>
-          <w:bookmarkStart w:id="67" w:name="tbl-reliability-4f"/>
+          <w:bookmarkStart w:id="66" w:name="tbl-reliability-4f"/>
           <w:p>
             <w:pPr>
               <w:jc w:val="center"/>
             </w:pPr>
             <w:pPr>
-              <w:jc w:val="start"/>
+              <w:jc w:val="left"/>
               <w:spacing w:before="200"/>
               <w:pStyle w:val="ImageCaption"/>
             </w:pPr>
@@ -14741,7 +14377,7 @@
               </w:tc>
             </w:tr>
           </w:tbl>
-          <w:bookmarkEnd w:id="67"/>
+          <w:bookmarkEnd w:id="66"/>
           <w:p/>
         </w:tc>
       </w:tr>
@@ -14751,67 +14387,41 @@
         <w:pStyle w:val="BodyText"/>
       </w:pPr>
       <w:r>
-        <w:rPr>
-          <w:vertAlign w:val="subscript"/>
-        </w:rPr>
-        <w:t xml:space="preserve">Source:</w:t>
-      </w:r>
-      <w:r>
-        <w:rPr>
-          <w:vertAlign w:val="subscript"/>
-        </w:rPr>
+        <w:t xml:space="preserve">All four domains show composite reliability (omega) above .70, indicating</w:t>
+      </w:r>
+      <w:r>
         <w:t xml:space="preserve"> </w:t>
       </w:r>
-      <w:hyperlink r:id="rId25">
-        <w:r>
-          <w:rPr>
-            <w:rStyle w:val="Hyperlink"/>
-            <w:vertAlign w:val="subscript"/>
-          </w:rPr>
-          <w:t xml:space="preserve">Article Notebook</w:t>
-        </w:r>
-      </w:hyperlink>
+      <w:r>
+        <w:t xml:space="preserve">adequate internal consistency. The AVE values are acceptable for most domains,</w:t>
+      </w:r>
+      <w:r>
+        <w:t xml:space="preserve"> </w:t>
+      </w:r>
+      <w:r>
+        <w:t xml:space="preserve">with the Environment domain showing a slightly lower value — consistent with</w:t>
+      </w:r>
+      <w:r>
+        <w:t xml:space="preserve"> </w:t>
+      </w:r>
+      <w:r>
+        <w:t xml:space="preserve">its broader and more heterogeneous item content. The Social domain, despite</w:t>
+      </w:r>
+      <w:r>
+        <w:t xml:space="preserve"> </w:t>
+      </w:r>
+      <w:r>
+        <w:t xml:space="preserve">having only three items, shows strong reliability due to the high factor</w:t>
+      </w:r>
+      <w:r>
+        <w:t xml:space="preserve"> </w:t>
+      </w:r>
+      <w:r>
+        <w:t xml:space="preserve">loadings of Q20, Q21, and Q22.</w:t>
+      </w:r>
     </w:p>
-    <w:p>
-      <w:pPr>
-        <w:pStyle w:val="BodyText"/>
-      </w:pPr>
-      <w:r>
-        <w:t xml:space="preserve">All four domains show composite reliability (omega) above .70, indicating</w:t>
-      </w:r>
-      <w:r>
-        <w:t xml:space="preserve"> </w:t>
-      </w:r>
-      <w:r>
-        <w:t xml:space="preserve">adequate internal consistency. The AVE values are acceptable for most domains,</w:t>
-      </w:r>
-      <w:r>
-        <w:t xml:space="preserve"> </w:t>
-      </w:r>
-      <w:r>
-        <w:t xml:space="preserve">with the Environment domain showing a slightly lower value — consistent with</w:t>
-      </w:r>
-      <w:r>
-        <w:t xml:space="preserve"> </w:t>
-      </w:r>
-      <w:r>
-        <w:t xml:space="preserve">its broader and more heterogeneous item content. The Social domain, despite</w:t>
-      </w:r>
-      <w:r>
-        <w:t xml:space="preserve"> </w:t>
-      </w:r>
-      <w:r>
-        <w:t xml:space="preserve">having only three items, shows strong reliability due to the high factor</w:t>
-      </w:r>
-      <w:r>
-        <w:t xml:space="preserve"> </w:t>
-      </w:r>
-      <w:r>
-        <w:t xml:space="preserve">loadings of Q20, Q21, and Q22.</w:t>
-      </w:r>
-    </w:p>
-    <w:bookmarkEnd w:id="68"/>
-    <w:bookmarkStart w:id="69" w:name="preliminary-evaluation-summary"/>
+    <w:bookmarkEnd w:id="67"/>
+    <w:bookmarkStart w:id="68" w:name="preliminary-evaluation-summary"/>
     <w:p>
       <w:pPr>
         <w:pStyle w:val="Heading4"/>
@@ -14936,9 +14546,9 @@
         <w:t xml:space="preserve">for all domains</w:t>
       </w:r>
     </w:p>
+    <w:bookmarkEnd w:id="68"/>
     <w:bookmarkEnd w:id="69"/>
-    <w:bookmarkEnd w:id="70"/>
-    <w:bookmarkStart w:id="78" w:name="path-diagrams"/>
+    <w:bookmarkStart w:id="77" w:name="path-diagrams"/>
     <w:p>
       <w:pPr>
         <w:pStyle w:val="Heading3"/>
@@ -14972,17 +14582,16 @@
         <w:tblStyle w:val="Table"/>
         <w:tblLook w:firstRow="0" w:lastRow="0" w:firstColumn="0" w:lastColumn="0" w:noHBand="0" w:noVBand="0" w:val="0000"/>
         <w:tblBorders>
+          <w:top w:val="single" w:sz="4" w:space="0" w:color="0758E5"/>
           <w:left w:val="single" w:sz="24" w:space="0" w:color="0758E5"/>
+          <w:bottom w:val="single" w:sz="4" w:space="0" w:color="0758E5"/>
           <w:right w:val="single" w:sz="4" w:space="0" w:color="0758E5"/>
-          <w:top w:val="single" w:sz="4" w:space="0" w:color="0758E5"/>
-          <w:bottom w:val="single" w:sz="4" w:space="0" w:color="0758E5"/>
         </w:tblBorders>
         <w:tblCellMar>
           <w:left w:w="144" w:type="dxa"/>
           <w:right w:w="144" w:type="dxa"/>
         </w:tblCellMar>
-        <w:tblInd w:w="164" w:type="dxa"/>
-        <w:tblW w:type="pct" w:w="100%"/>
+        <w:tblLook w:firstRow="0" w:lastRow="0" w:firstColumn="0" w:lastColumn="0" w:noHBand="0" w:noVBand="0" w:val="0000"/>
       </w:tblPr>
       <w:tr>
         <w:trPr>
@@ -15009,18 +14618,18 @@
                 <wp:inline>
                   <wp:extent cx="152400" cy="152400"/>
                   <wp:effectExtent b="0" l="0" r="0" t="0"/>
-                  <wp:docPr descr="" title="" id="71" name="Picture"/>
+                  <wp:docPr descr="" title="" id="70" name="Picture"/>
                   <a:graphic>
                     <a:graphicData uri="http://schemas.openxmlformats.org/drawingml/2006/picture">
                       <pic:pic>
                         <pic:nvPicPr>
-                          <pic:cNvPr descr="C:\Program Files\RStudio\resources\app\bin\quarto\share\formats\docx\note.png" id="72" name="Picture"/>
+                          <pic:cNvPr descr="C:\Program Files\RStudio\resources\app\bin\quarto\share\formats\docx\note.png" id="71" name="Picture"/>
                           <pic:cNvPicPr>
                             <a:picLocks noChangeArrowheads="1" noChangeAspect="1"/>
                           </pic:cNvPicPr>
                         </pic:nvPicPr>
                         <pic:blipFill>
-                          <a:blip r:embed="rId26"/>
+                          <a:blip r:embed="rId25"/>
                           <a:stretch>
                             <a:fillRect/>
                           </a:stretch>
@@ -15080,10 +14689,11 @@
               <w:t xml:space="preserve">Consider this layout for educational purposes, as for your article you should create something better formatted, which will almost always be done by hand.</w:t>
             </w:r>
           </w:p>
+          <w:p/>
         </w:tc>
       </w:tr>
     </w:tbl>
-    <w:bookmarkStart w:id="77" w:name="cell-fig-diagram-4f-circle"/>
+    <w:bookmarkStart w:id="76" w:name="cell-fig-diagram-4f-circle"/>
     <w:tbl>
       <w:tblPr>
         <w:tblStyle w:val="Table"/>
@@ -15097,7 +14707,7 @@
       <w:tr>
         <w:tc>
           <w:tcPr/>
-          <w:bookmarkStart w:id="76" w:name="fig-diagram-4f-circle"/>
+          <w:bookmarkStart w:id="75" w:name="fig-diagram-4f-circle"/>
           <w:p>
             <w:pPr>
               <w:pStyle w:val="Compact"/>
@@ -15108,18 +14718,18 @@
                 <wp:inline>
                   <wp:extent cx="5334000" cy="5334000"/>
                   <wp:effectExtent b="0" l="0" r="0" t="0"/>
-                  <wp:docPr descr="" title="" id="74" name="Picture"/>
+                  <wp:docPr descr="" title="" id="73" name="Picture"/>
                   <a:graphic>
                     <a:graphicData uri="http://schemas.openxmlformats.org/drawingml/2006/picture">
                       <pic:pic>
                         <pic:nvPicPr>
-                          <pic:cNvPr descr="index_files/figure-docx/fig-diagram-4f-circle-1.png" id="75" name="Picture"/>
+                          <pic:cNvPr descr="index_files/figure-docx/fig-diagram-4f-circle-1.png" id="74" name="Picture"/>
                           <pic:cNvPicPr>
                             <a:picLocks noChangeArrowheads="1" noChangeAspect="1"/>
                           </pic:cNvPicPr>
                         </pic:nvPicPr>
                         <pic:blipFill>
-                          <a:blip r:embed="rId73"/>
+                          <a:blip r:embed="rId72"/>
                           <a:stretch>
                             <a:fillRect/>
                           </a:stretch>
@@ -15151,7 +14761,7 @@
               <w:jc w:val="center"/>
             </w:pPr>
             <w:pPr>
-              <w:jc w:val="start"/>
+              <w:jc w:val="left"/>
               <w:spacing w:before="200"/>
               <w:pStyle w:val="ImageCaption"/>
             </w:pPr>
@@ -15159,37 +14769,11 @@
               <w:t xml:space="preserve">Figure 2: Path diagram of the 4-factor CFA model (circle layout)</w:t>
             </w:r>
           </w:p>
-          <w:bookmarkEnd w:id="76"/>
+          <w:bookmarkEnd w:id="75"/>
         </w:tc>
       </w:tr>
     </w:tbl>
-    <w:p>
-      <w:pPr>
-        <w:pStyle w:val="BodyText"/>
-      </w:pPr>
-      <w:r>
-        <w:rPr>
-          <w:vertAlign w:val="subscript"/>
-        </w:rPr>
-        <w:t xml:space="preserve">Source:</w:t>
-      </w:r>
-      <w:r>
-        <w:rPr>
-          <w:vertAlign w:val="subscript"/>
-        </w:rPr>
-        <w:t xml:space="preserve"> </w:t>
-      </w:r>
-      <w:hyperlink r:id="rId25">
-        <w:r>
-          <w:rPr>
-            <w:rStyle w:val="Hyperlink"/>
-            <w:vertAlign w:val="subscript"/>
-          </w:rPr>
-          <w:t xml:space="preserve">Article Notebook</w:t>
-        </w:r>
-      </w:hyperlink>
-    </w:p>
-    <w:bookmarkEnd w:id="77"/>
+    <w:bookmarkEnd w:id="76"/>
     <w:p>
       <w:pPr>
         <w:pStyle w:val="BodyText"/>
@@ -15233,9 +14817,9 @@
         <w:t xml:space="preserve">following sections.</w:t>
       </w:r>
     </w:p>
+    <w:bookmarkEnd w:id="77"/>
     <w:bookmarkEnd w:id="78"/>
-    <w:bookmarkEnd w:id="79"/>
-    <w:bookmarkStart w:id="103" w:name="sec-bifactor"/>
+    <w:bookmarkStart w:id="102" w:name="sec-bifactor"/>
     <w:p>
       <w:pPr>
         <w:pStyle w:val="Heading2"/>
@@ -15329,17 +14913,16 @@
         <w:tblStyle w:val="Table"/>
         <w:tblLook w:firstRow="0" w:lastRow="0" w:firstColumn="0" w:lastColumn="0" w:noHBand="0" w:noVBand="0" w:val="0000"/>
         <w:tblBorders>
+          <w:top w:val="single" w:sz="4" w:space="0" w:color="0758E5"/>
           <w:left w:val="single" w:sz="24" w:space="0" w:color="0758E5"/>
+          <w:bottom w:val="single" w:sz="4" w:space="0" w:color="0758E5"/>
           <w:right w:val="single" w:sz="4" w:space="0" w:color="0758E5"/>
-          <w:top w:val="single" w:sz="4" w:space="0" w:color="0758E5"/>
-          <w:bottom w:val="single" w:sz="4" w:space="0" w:color="0758E5"/>
         </w:tblBorders>
         <w:tblCellMar>
           <w:left w:w="144" w:type="dxa"/>
           <w:right w:w="144" w:type="dxa"/>
         </w:tblCellMar>
-        <w:tblInd w:w="164" w:type="dxa"/>
-        <w:tblW w:type="pct" w:w="100%"/>
+        <w:tblLook w:firstRow="0" w:lastRow="0" w:firstColumn="0" w:lastColumn="0" w:noHBand="0" w:noVBand="0" w:val="0000"/>
       </w:tblPr>
       <w:tr>
         <w:trPr>
@@ -15366,18 +14949,18 @@
                 <wp:inline>
                   <wp:extent cx="152400" cy="152400"/>
                   <wp:effectExtent b="0" l="0" r="0" t="0"/>
-                  <wp:docPr descr="" title="" id="80" name="Picture"/>
+                  <wp:docPr descr="" title="" id="79" name="Picture"/>
                   <a:graphic>
                     <a:graphicData uri="http://schemas.openxmlformats.org/drawingml/2006/picture">
                       <pic:pic>
                         <pic:nvPicPr>
-                          <pic:cNvPr descr="C:\Program Files\RStudio\resources\app\bin\quarto\share\formats\docx\note.png" id="81" name="Picture"/>
+                          <pic:cNvPr descr="C:\Program Files\RStudio\resources\app\bin\quarto\share\formats\docx\note.png" id="80" name="Picture"/>
                           <pic:cNvPicPr>
                             <a:picLocks noChangeArrowheads="1" noChangeAspect="1"/>
                           </pic:cNvPicPr>
                         </pic:nvPicPr>
                         <pic:blipFill>
-                          <a:blip r:embed="rId26"/>
+                          <a:blip r:embed="rId25"/>
                           <a:stretch>
                             <a:fillRect/>
                           </a:stretch>
@@ -15476,10 +15059,11 @@
               <w:t xml:space="preserve">models.</w:t>
             </w:r>
           </w:p>
+          <w:p/>
         </w:tc>
       </w:tr>
     </w:tbl>
-    <w:bookmarkStart w:id="82" w:name="model-specification-1"/>
+    <w:bookmarkStart w:id="81" w:name="model-specification-1"/>
     <w:p>
       <w:pPr>
         <w:pStyle w:val="Heading3"/>
@@ -15521,34 +15105,8 @@
         <w:t xml:space="preserve">the general factor, which absorbs their shared variance.</w:t>
       </w:r>
     </w:p>
-    <w:p>
-      <w:pPr>
-        <w:pStyle w:val="BodyText"/>
-      </w:pPr>
-      <w:r>
-        <w:rPr>
-          <w:vertAlign w:val="subscript"/>
-        </w:rPr>
-        <w:t xml:space="preserve">Source:</w:t>
-      </w:r>
-      <w:r>
-        <w:rPr>
-          <w:vertAlign w:val="subscript"/>
-        </w:rPr>
-        <w:t xml:space="preserve"> </w:t>
-      </w:r>
-      <w:hyperlink r:id="rId25">
-        <w:r>
-          <w:rPr>
-            <w:rStyle w:val="Hyperlink"/>
-            <w:vertAlign w:val="subscript"/>
-          </w:rPr>
-          <w:t xml:space="preserve">Article Notebook</w:t>
-        </w:r>
-      </w:hyperlink>
-    </w:p>
-    <w:bookmarkEnd w:id="82"/>
-    <w:bookmarkStart w:id="83" w:name="model-estimation-1"/>
+    <w:bookmarkEnd w:id="81"/>
+    <w:bookmarkStart w:id="82" w:name="model-estimation-1"/>
     <w:p>
       <w:pPr>
         <w:pStyle w:val="Heading3"/>
@@ -15602,34 +15160,8 @@
         <w:t xml:space="preserve">zero correlations between all factors.</w:t>
       </w:r>
     </w:p>
-    <w:p>
-      <w:pPr>
-        <w:pStyle w:val="BodyText"/>
-      </w:pPr>
-      <w:r>
-        <w:rPr>
-          <w:vertAlign w:val="subscript"/>
-        </w:rPr>
-        <w:t xml:space="preserve">Source:</w:t>
-      </w:r>
-      <w:r>
-        <w:rPr>
-          <w:vertAlign w:val="subscript"/>
-        </w:rPr>
-        <w:t xml:space="preserve"> </w:t>
-      </w:r>
-      <w:hyperlink r:id="rId25">
-        <w:r>
-          <w:rPr>
-            <w:rStyle w:val="Hyperlink"/>
-            <w:vertAlign w:val="subscript"/>
-          </w:rPr>
-          <w:t xml:space="preserve">Article Notebook</w:t>
-        </w:r>
-      </w:hyperlink>
-    </w:p>
-    <w:bookmarkEnd w:id="83"/>
-    <w:bookmarkStart w:id="94" w:name="model-evaluation"/>
+    <w:bookmarkEnd w:id="82"/>
+    <w:bookmarkStart w:id="93" w:name="model-evaluation"/>
     <w:p>
       <w:pPr>
         <w:pStyle w:val="Heading3"/>
@@ -15651,13 +15183,13 @@
       <w:tr>
         <w:tc>
           <w:tcPr/>
-          <w:bookmarkStart w:id="84" w:name="tbl-fit-4f-bi"/>
+          <w:bookmarkStart w:id="83" w:name="tbl-fit-4f-bi"/>
           <w:p>
             <w:pPr>
               <w:jc w:val="center"/>
             </w:pPr>
             <w:pPr>
-              <w:jc w:val="start"/>
+              <w:jc w:val="left"/>
               <w:spacing w:before="200"/>
               <w:pStyle w:val="ImageCaption"/>
             </w:pPr>
@@ -15897,37 +15429,11 @@
               </w:tc>
             </w:tr>
           </w:tbl>
-          <w:bookmarkEnd w:id="84"/>
+          <w:bookmarkEnd w:id="83"/>
           <w:p/>
         </w:tc>
       </w:tr>
     </w:tbl>
-    <w:p>
-      <w:pPr>
-        <w:pStyle w:val="BodyText"/>
-      </w:pPr>
-      <w:r>
-        <w:rPr>
-          <w:vertAlign w:val="subscript"/>
-        </w:rPr>
-        <w:t xml:space="preserve">Source:</w:t>
-      </w:r>
-      <w:r>
-        <w:rPr>
-          <w:vertAlign w:val="subscript"/>
-        </w:rPr>
-        <w:t xml:space="preserve"> </w:t>
-      </w:r>
-      <w:hyperlink r:id="rId25">
-        <w:r>
-          <w:rPr>
-            <w:rStyle w:val="Hyperlink"/>
-            <w:vertAlign w:val="subscript"/>
-          </w:rPr>
-          <w:t xml:space="preserve">Article Notebook</w:t>
-        </w:r>
-      </w:hyperlink>
-    </w:p>
     <w:p>
       <w:pPr>
         <w:pStyle w:val="BodyText"/>
@@ -15949,13 +15455,13 @@
       <w:tr>
         <w:tc>
           <w:tcPr/>
-          <w:bookmarkStart w:id="85" w:name="tbl-loadings-4f-bi"/>
+          <w:bookmarkStart w:id="84" w:name="tbl-loadings-4f-bi"/>
           <w:p>
             <w:pPr>
               <w:jc w:val="center"/>
             </w:pPr>
             <w:pPr>
-              <w:jc w:val="start"/>
+              <w:jc w:val="left"/>
               <w:spacing w:before="200"/>
               <w:pStyle w:val="ImageCaption"/>
             </w:pPr>
@@ -19129,37 +18635,11 @@
               </w:tc>
             </w:tr>
           </w:tbl>
-          <w:bookmarkEnd w:id="85"/>
+          <w:bookmarkEnd w:id="84"/>
           <w:p/>
         </w:tc>
       </w:tr>
     </w:tbl>
-    <w:p>
-      <w:pPr>
-        <w:pStyle w:val="BodyText"/>
-      </w:pPr>
-      <w:r>
-        <w:rPr>
-          <w:vertAlign w:val="subscript"/>
-        </w:rPr>
-        <w:t xml:space="preserve">Source:</w:t>
-      </w:r>
-      <w:r>
-        <w:rPr>
-          <w:vertAlign w:val="subscript"/>
-        </w:rPr>
-        <w:t xml:space="preserve"> </w:t>
-      </w:r>
-      <w:hyperlink r:id="rId25">
-        <w:r>
-          <w:rPr>
-            <w:rStyle w:val="Hyperlink"/>
-            <w:vertAlign w:val="subscript"/>
-          </w:rPr>
-          <w:t xml:space="preserve">Article Notebook</w:t>
-        </w:r>
-      </w:hyperlink>
-    </w:p>
     <w:p>
       <w:pPr>
         <w:pStyle w:val="BodyText"/>
@@ -19255,13 +18735,13 @@
       <w:tr>
         <w:tc>
           <w:tcPr/>
-          <w:bookmarkStart w:id="86" w:name="tbl-mi-bifactor"/>
+          <w:bookmarkStart w:id="85" w:name="tbl-mi-bifactor"/>
           <w:p>
             <w:pPr>
               <w:jc w:val="center"/>
             </w:pPr>
             <w:pPr>
-              <w:jc w:val="start"/>
+              <w:jc w:val="left"/>
               <w:spacing w:before="200"/>
               <w:pStyle w:val="ImageCaption"/>
             </w:pPr>
@@ -20962,38 +20442,12 @@
               </w:tc>
             </w:tr>
           </w:tbl>
-          <w:bookmarkEnd w:id="86"/>
+          <w:bookmarkEnd w:id="85"/>
           <w:p/>
         </w:tc>
       </w:tr>
     </w:tbl>
-    <w:p>
-      <w:pPr>
-        <w:pStyle w:val="BodyText"/>
-      </w:pPr>
-      <w:r>
-        <w:rPr>
-          <w:vertAlign w:val="subscript"/>
-        </w:rPr>
-        <w:t xml:space="preserve">Source:</w:t>
-      </w:r>
-      <w:r>
-        <w:rPr>
-          <w:vertAlign w:val="subscript"/>
-        </w:rPr>
-        <w:t xml:space="preserve"> </w:t>
-      </w:r>
-      <w:hyperlink r:id="rId25">
-        <w:r>
-          <w:rPr>
-            <w:rStyle w:val="Hyperlink"/>
-            <w:vertAlign w:val="subscript"/>
-          </w:rPr>
-          <w:t xml:space="preserve">Article Notebook</w:t>
-        </w:r>
-      </w:hyperlink>
-    </w:p>
-    <w:bookmarkStart w:id="91" w:name="cell-fig-residuals-4f-bi"/>
+    <w:bookmarkStart w:id="90" w:name="cell-fig-residuals-4f-bi"/>
     <w:tbl>
       <w:tblPr>
         <w:tblStyle w:val="Table"/>
@@ -21007,7 +20461,7 @@
       <w:tr>
         <w:tc>
           <w:tcPr/>
-          <w:bookmarkStart w:id="90" w:name="fig-residuals-4f-bi"/>
+          <w:bookmarkStart w:id="89" w:name="fig-residuals-4f-bi"/>
           <w:p>
             <w:pPr>
               <w:pStyle w:val="Compact"/>
@@ -21018,18 +20472,18 @@
                 <wp:inline>
                   <wp:extent cx="5334000" cy="4667250"/>
                   <wp:effectExtent b="0" l="0" r="0" t="0"/>
-                  <wp:docPr descr="" title="" id="88" name="Picture"/>
+                  <wp:docPr descr="" title="" id="87" name="Picture"/>
                   <a:graphic>
                     <a:graphicData uri="http://schemas.openxmlformats.org/drawingml/2006/picture">
                       <pic:pic>
                         <pic:nvPicPr>
-                          <pic:cNvPr descr="index_files/figure-docx/fig-residuals-4f-bi-1.png" id="89" name="Picture"/>
+                          <pic:cNvPr descr="index_files/figure-docx/fig-residuals-4f-bi-1.png" id="88" name="Picture"/>
                           <pic:cNvPicPr>
                             <a:picLocks noChangeArrowheads="1" noChangeAspect="1"/>
                           </pic:cNvPicPr>
                         </pic:nvPicPr>
                         <pic:blipFill>
-                          <a:blip r:embed="rId87"/>
+                          <a:blip r:embed="rId86"/>
                           <a:stretch>
                             <a:fillRect/>
                           </a:stretch>
@@ -21061,7 +20515,7 @@
               <w:jc w:val="center"/>
             </w:pPr>
             <w:pPr>
-              <w:jc w:val="start"/>
+              <w:jc w:val="left"/>
               <w:spacing w:before="200"/>
               <w:pStyle w:val="ImageCaption"/>
             </w:pPr>
@@ -21069,38 +20523,12 @@
               <w:t xml:space="preserve">Figure 3: Heatmap of standardized residual correlations for the bifactor 4-factor model</w:t>
             </w:r>
           </w:p>
-          <w:bookmarkEnd w:id="90"/>
+          <w:bookmarkEnd w:id="89"/>
         </w:tc>
       </w:tr>
     </w:tbl>
-    <w:p>
-      <w:pPr>
-        <w:pStyle w:val="BodyText"/>
-      </w:pPr>
-      <w:r>
-        <w:rPr>
-          <w:vertAlign w:val="subscript"/>
-        </w:rPr>
-        <w:t xml:space="preserve">Source:</w:t>
-      </w:r>
-      <w:r>
-        <w:rPr>
-          <w:vertAlign w:val="subscript"/>
-        </w:rPr>
-        <w:t xml:space="preserve"> </w:t>
-      </w:r>
-      <w:hyperlink r:id="rId25">
-        <w:r>
-          <w:rPr>
-            <w:rStyle w:val="Hyperlink"/>
-            <w:vertAlign w:val="subscript"/>
-          </w:rPr>
-          <w:t xml:space="preserve">Article Notebook</w:t>
-        </w:r>
-      </w:hyperlink>
-    </w:p>
-    <w:bookmarkEnd w:id="91"/>
-    <w:bookmarkStart w:id="92" w:name="reliability"/>
+    <w:bookmarkEnd w:id="90"/>
+    <w:bookmarkStart w:id="91" w:name="reliability"/>
     <w:p>
       <w:pPr>
         <w:pStyle w:val="Heading4"/>
@@ -21512,61 +20940,35 @@
         <w:pStyle w:val="BodyText"/>
       </w:pPr>
       <w:r>
-        <w:rPr>
-          <w:vertAlign w:val="subscript"/>
-        </w:rPr>
-        <w:t xml:space="preserve">Source:</w:t>
-      </w:r>
-      <w:r>
-        <w:rPr>
-          <w:vertAlign w:val="subscript"/>
-        </w:rPr>
+        <w:t xml:space="preserve">The omega hierarchical value indicates that the general QOL factor accounts for</w:t>
+      </w:r>
+      <w:r>
         <w:t xml:space="preserve"> </w:t>
       </w:r>
-      <w:hyperlink r:id="rId25">
-        <w:r>
-          <w:rPr>
-            <w:rStyle w:val="Hyperlink"/>
-            <w:vertAlign w:val="subscript"/>
-          </w:rPr>
-          <w:t xml:space="preserve">Article Notebook</w:t>
-        </w:r>
-      </w:hyperlink>
+      <w:r>
+        <w:t xml:space="preserve">a substantial proportion of reliable variance. The Psychological specific</w:t>
+      </w:r>
+      <w:r>
+        <w:t xml:space="preserve"> </w:t>
+      </w:r>
+      <w:r>
+        <w:t xml:space="preserve">factor contributes very little unique reliable variance beyond the general</w:t>
+      </w:r>
+      <w:r>
+        <w:t xml:space="preserve"> </w:t>
+      </w:r>
+      <w:r>
+        <w:t xml:space="preserve">factor, confirming the pattern observed in the loadings. The Physical,</w:t>
+      </w:r>
+      <w:r>
+        <w:t xml:space="preserve"> </w:t>
+      </w:r>
+      <w:r>
+        <w:t xml:space="preserve">Social, and Environment specific factors retain more meaningful unique variance.</w:t>
+      </w:r>
     </w:p>
-    <w:p>
-      <w:pPr>
-        <w:pStyle w:val="BodyText"/>
-      </w:pPr>
-      <w:r>
-        <w:t xml:space="preserve">The omega hierarchical value indicates that the general QOL factor accounts for</w:t>
-      </w:r>
-      <w:r>
-        <w:t xml:space="preserve"> </w:t>
-      </w:r>
-      <w:r>
-        <w:t xml:space="preserve">a substantial proportion of reliable variance. The Psychological specific</w:t>
-      </w:r>
-      <w:r>
-        <w:t xml:space="preserve"> </w:t>
-      </w:r>
-      <w:r>
-        <w:t xml:space="preserve">factor contributes very little unique reliable variance beyond the general</w:t>
-      </w:r>
-      <w:r>
-        <w:t xml:space="preserve"> </w:t>
-      </w:r>
-      <w:r>
-        <w:t xml:space="preserve">factor, confirming the pattern observed in the loadings. The Physical,</w:t>
-      </w:r>
-      <w:r>
-        <w:t xml:space="preserve"> </w:t>
-      </w:r>
-      <w:r>
-        <w:t xml:space="preserve">Social, and Environment specific factors retain more meaningful unique variance.</w:t>
-      </w:r>
-    </w:p>
-    <w:bookmarkEnd w:id="92"/>
-    <w:bookmarkStart w:id="93" w:name="preliminary-evaluation-summary-1"/>
+    <w:bookmarkEnd w:id="91"/>
+    <w:bookmarkStart w:id="92" w:name="preliminary-evaluation-summary-1"/>
     <w:p>
       <w:pPr>
         <w:pStyle w:val="Heading4"/>
@@ -21683,9 +21085,9 @@
         <w:t xml:space="preserve">that may not hold empirically</w:t>
       </w:r>
     </w:p>
+    <w:bookmarkEnd w:id="92"/>
     <w:bookmarkEnd w:id="93"/>
-    <w:bookmarkEnd w:id="94"/>
-    <w:bookmarkStart w:id="102" w:name="path-diagram"/>
+    <w:bookmarkStart w:id="101" w:name="path-diagram"/>
     <w:p>
       <w:pPr>
         <w:pStyle w:val="Heading3"/>
@@ -21723,7 +21125,7 @@
         <w:t xml:space="preserve">general factor centrally and specific factors on the sides.</w:t>
       </w:r>
     </w:p>
-    <w:bookmarkStart w:id="99" w:name="cell-fig-diagram-bifactor"/>
+    <w:bookmarkStart w:id="98" w:name="cell-fig-diagram-bifactor"/>
     <w:tbl>
       <w:tblPr>
         <w:tblStyle w:val="Table"/>
@@ -21737,7 +21139,7 @@
       <w:tr>
         <w:tc>
           <w:tcPr/>
-          <w:bookmarkStart w:id="98" w:name="fig-diagram-bifactor"/>
+          <w:bookmarkStart w:id="97" w:name="fig-diagram-bifactor"/>
           <w:p>
             <w:pPr>
               <w:pStyle w:val="Compact"/>
@@ -21748,18 +21150,18 @@
                 <wp:inline>
                   <wp:extent cx="5334000" cy="6667500"/>
                   <wp:effectExtent b="0" l="0" r="0" t="0"/>
-                  <wp:docPr descr="" title="" id="96" name="Picture"/>
+                  <wp:docPr descr="" title="" id="95" name="Picture"/>
                   <a:graphic>
                     <a:graphicData uri="http://schemas.openxmlformats.org/drawingml/2006/picture">
                       <pic:pic>
                         <pic:nvPicPr>
-                          <pic:cNvPr descr="index_files/figure-docx/fig-diagram-bifactor-1.png" id="97" name="Picture"/>
+                          <pic:cNvPr descr="index_files/figure-docx/fig-diagram-bifactor-1.png" id="96" name="Picture"/>
                           <pic:cNvPicPr>
                             <a:picLocks noChangeArrowheads="1" noChangeAspect="1"/>
                           </pic:cNvPicPr>
                         </pic:nvPicPr>
                         <pic:blipFill>
-                          <a:blip r:embed="rId95"/>
+                          <a:blip r:embed="rId94"/>
                           <a:stretch>
                             <a:fillRect/>
                           </a:stretch>
@@ -21791,7 +21193,7 @@
               <w:jc w:val="center"/>
             </w:pPr>
             <w:pPr>
-              <w:jc w:val="start"/>
+              <w:jc w:val="left"/>
               <w:spacing w:before="200"/>
               <w:pStyle w:val="ImageCaption"/>
             </w:pPr>
@@ -21799,53 +21201,26 @@
               <w:t xml:space="preserve">Figure 4: Path diagram of the bifactor CFA model</w:t>
             </w:r>
           </w:p>
-          <w:bookmarkEnd w:id="98"/>
+          <w:bookmarkEnd w:id="97"/>
         </w:tc>
       </w:tr>
     </w:tbl>
-    <w:p>
-      <w:pPr>
-        <w:pStyle w:val="BodyText"/>
-      </w:pPr>
-      <w:r>
-        <w:rPr>
-          <w:vertAlign w:val="subscript"/>
-        </w:rPr>
-        <w:t xml:space="preserve">Source:</w:t>
-      </w:r>
-      <w:r>
-        <w:rPr>
-          <w:vertAlign w:val="subscript"/>
-        </w:rPr>
-        <w:t xml:space="preserve"> </w:t>
-      </w:r>
-      <w:hyperlink r:id="rId25">
-        <w:r>
-          <w:rPr>
-            <w:rStyle w:val="Hyperlink"/>
-            <w:vertAlign w:val="subscript"/>
-          </w:rPr>
-          <w:t xml:space="preserve">Article Notebook</w:t>
-        </w:r>
-      </w:hyperlink>
-    </w:p>
-    <w:bookmarkEnd w:id="99"/>
+    <w:bookmarkEnd w:id="98"/>
     <w:tbl>
       <w:tblPr>
         <w:tblStyle w:val="Table"/>
         <w:tblLook w:firstRow="0" w:lastRow="0" w:firstColumn="0" w:lastColumn="0" w:noHBand="0" w:noVBand="0" w:val="0000"/>
         <w:tblBorders>
+          <w:top w:val="single" w:sz="4" w:space="0" w:color="0758E5"/>
           <w:left w:val="single" w:sz="24" w:space="0" w:color="0758E5"/>
+          <w:bottom w:val="single" w:sz="4" w:space="0" w:color="0758E5"/>
           <w:right w:val="single" w:sz="4" w:space="0" w:color="0758E5"/>
-          <w:top w:val="single" w:sz="4" w:space="0" w:color="0758E5"/>
-          <w:bottom w:val="single" w:sz="4" w:space="0" w:color="0758E5"/>
         </w:tblBorders>
         <w:tblCellMar>
           <w:left w:w="144" w:type="dxa"/>
           <w:right w:w="144" w:type="dxa"/>
         </w:tblCellMar>
-        <w:tblInd w:w="164" w:type="dxa"/>
-        <w:tblW w:type="pct" w:w="100%"/>
+        <w:tblLook w:firstRow="0" w:lastRow="0" w:firstColumn="0" w:lastColumn="0" w:noHBand="0" w:noVBand="0" w:val="0000"/>
       </w:tblPr>
       <w:tr>
         <w:trPr>
@@ -21872,18 +21247,18 @@
                 <wp:inline>
                   <wp:extent cx="152400" cy="152400"/>
                   <wp:effectExtent b="0" l="0" r="0" t="0"/>
-                  <wp:docPr descr="" title="" id="100" name="Picture"/>
+                  <wp:docPr descr="" title="" id="99" name="Picture"/>
                   <a:graphic>
                     <a:graphicData uri="http://schemas.openxmlformats.org/drawingml/2006/picture">
                       <pic:pic>
                         <pic:nvPicPr>
-                          <pic:cNvPr descr="C:\Program Files\RStudio\resources\app\bin\quarto\share\formats\docx\note.png" id="101" name="Picture"/>
+                          <pic:cNvPr descr="C:\Program Files\RStudio\resources\app\bin\quarto\share\formats\docx\note.png" id="100" name="Picture"/>
                           <pic:cNvPicPr>
                             <a:picLocks noChangeArrowheads="1" noChangeAspect="1"/>
                           </pic:cNvPicPr>
                         </pic:nvPicPr>
                         <pic:blipFill>
-                          <a:blip r:embed="rId26"/>
+                          <a:blip r:embed="rId25"/>
                           <a:stretch>
                             <a:fillRect/>
                           </a:stretch>
@@ -21943,12 +21318,13 @@
               <w:t xml:space="preserve">You can test other formatting parameters (edge.label.cex, label.cex, edge.label.position, etc) to simulate path diagrams with better layouts.</w:t>
             </w:r>
           </w:p>
+          <w:p/>
         </w:tc>
       </w:tr>
     </w:tbl>
+    <w:bookmarkEnd w:id="101"/>
     <w:bookmarkEnd w:id="102"/>
-    <w:bookmarkEnd w:id="103"/>
-    <w:bookmarkStart w:id="126" w:name="sec-2nd"/>
+    <w:bookmarkStart w:id="125" w:name="sec-2nd"/>
     <w:p>
       <w:pPr>
         <w:pStyle w:val="Heading2"/>
@@ -22027,7 +21403,7 @@
         <w:t xml:space="preserve">interpretation from the bifactor model.</w:t>
       </w:r>
     </w:p>
-    <w:bookmarkStart w:id="106" w:name="model-specification-2"/>
+    <w:bookmarkStart w:id="105" w:name="model-specification-2"/>
     <w:p>
       <w:pPr>
         <w:pStyle w:val="Heading3"/>
@@ -22067,49 +21443,22 @@
       <w:r>
         <w:t xml:space="preserve">QOL factor.</w:t>
       </w:r>
-    </w:p>
-    <w:p>
-      <w:pPr>
-        <w:pStyle w:val="BodyText"/>
-      </w:pPr>
-      <w:r>
-        <w:rPr>
-          <w:vertAlign w:val="subscript"/>
-        </w:rPr>
-        <w:t xml:space="preserve">Source:</w:t>
-      </w:r>
-      <w:r>
-        <w:rPr>
-          <w:vertAlign w:val="subscript"/>
-        </w:rPr>
-        <w:t xml:space="preserve"> </w:t>
-      </w:r>
-      <w:hyperlink r:id="rId25">
-        <w:r>
-          <w:rPr>
-            <w:rStyle w:val="Hyperlink"/>
-            <w:vertAlign w:val="subscript"/>
-          </w:rPr>
-          <w:t xml:space="preserve">Article Notebook</w:t>
-        </w:r>
-      </w:hyperlink>
     </w:p>
     <w:tbl>
       <w:tblPr>
         <w:tblStyle w:val="Table"/>
         <w:tblLook w:firstRow="0" w:lastRow="0" w:firstColumn="0" w:lastColumn="0" w:noHBand="0" w:noVBand="0" w:val="0000"/>
         <w:tblBorders>
+          <w:top w:val="single" w:sz="4" w:space="0" w:color="EB9113"/>
           <w:left w:val="single" w:sz="24" w:space="0" w:color="EB9113"/>
+          <w:bottom w:val="single" w:sz="4" w:space="0" w:color="EB9113"/>
           <w:right w:val="single" w:sz="4" w:space="0" w:color="EB9113"/>
-          <w:top w:val="single" w:sz="4" w:space="0" w:color="EB9113"/>
-          <w:bottom w:val="single" w:sz="4" w:space="0" w:color="EB9113"/>
         </w:tblBorders>
         <w:tblCellMar>
           <w:left w:w="144" w:type="dxa"/>
           <w:right w:w="144" w:type="dxa"/>
         </w:tblCellMar>
-        <w:tblInd w:w="164" w:type="dxa"/>
-        <w:tblW w:type="pct" w:w="100%"/>
+        <w:tblLook w:firstRow="0" w:lastRow="0" w:firstColumn="0" w:lastColumn="0" w:noHBand="0" w:noVBand="0" w:val="0000"/>
       </w:tblPr>
       <w:tr>
         <w:trPr>
@@ -22136,18 +21485,18 @@
                 <wp:inline>
                   <wp:extent cx="152400" cy="152400"/>
                   <wp:effectExtent b="0" l="0" r="0" t="0"/>
-                  <wp:docPr descr="" title="" id="104" name="Picture"/>
+                  <wp:docPr descr="" title="" id="103" name="Picture"/>
                   <a:graphic>
                     <a:graphicData uri="http://schemas.openxmlformats.org/drawingml/2006/picture">
                       <pic:pic>
                         <pic:nvPicPr>
-                          <pic:cNvPr descr="C:\Program Files\RStudio\resources\app\bin\quarto\share\formats\docx\warning.png" id="105" name="Picture"/>
+                          <pic:cNvPr descr="C:\Program Files\RStudio\resources\app\bin\quarto\share\formats\docx\warning.png" id="104" name="Picture"/>
                           <pic:cNvPicPr>
                             <a:picLocks noChangeArrowheads="1" noChangeAspect="1"/>
                           </pic:cNvPicPr>
                         </pic:nvPicPr>
                         <pic:blipFill>
-                          <a:blip r:embed="rId57"/>
+                          <a:blip r:embed="rId56"/>
                           <a:stretch>
                             <a:fillRect/>
                           </a:stretch>
@@ -22240,11 +21589,12 @@
               <w:t xml:space="preserve">where the Psychological specific factor had minimal importance.</w:t>
             </w:r>
           </w:p>
+          <w:p/>
         </w:tc>
       </w:tr>
     </w:tbl>
-    <w:bookmarkEnd w:id="106"/>
-    <w:bookmarkStart w:id="107" w:name="model-estimation-2"/>
+    <w:bookmarkEnd w:id="105"/>
+    <w:bookmarkStart w:id="106" w:name="model-estimation-2"/>
     <w:p>
       <w:pPr>
         <w:pStyle w:val="Heading3"/>
@@ -22282,34 +21632,8 @@
         <w:t xml:space="preserve">its own identification constraints through the higher-order factor loadings.</w:t>
       </w:r>
     </w:p>
-    <w:p>
-      <w:pPr>
-        <w:pStyle w:val="BodyText"/>
-      </w:pPr>
-      <w:r>
-        <w:rPr>
-          <w:vertAlign w:val="subscript"/>
-        </w:rPr>
-        <w:t xml:space="preserve">Source:</w:t>
-      </w:r>
-      <w:r>
-        <w:rPr>
-          <w:vertAlign w:val="subscript"/>
-        </w:rPr>
-        <w:t xml:space="preserve"> </w:t>
-      </w:r>
-      <w:hyperlink r:id="rId25">
-        <w:r>
-          <w:rPr>
-            <w:rStyle w:val="Hyperlink"/>
-            <w:vertAlign w:val="subscript"/>
-          </w:rPr>
-          <w:t xml:space="preserve">Article Notebook</w:t>
-        </w:r>
-      </w:hyperlink>
-    </w:p>
-    <w:bookmarkEnd w:id="107"/>
-    <w:bookmarkStart w:id="119" w:name="model-evaluation-1"/>
+    <w:bookmarkEnd w:id="106"/>
+    <w:bookmarkStart w:id="118" w:name="model-evaluation-1"/>
     <w:p>
       <w:pPr>
         <w:pStyle w:val="Heading3"/>
@@ -22357,13 +21681,13 @@
       <w:tr>
         <w:tc>
           <w:tcPr/>
-          <w:bookmarkStart w:id="108" w:name="tbl-fit-4f-2or"/>
+          <w:bookmarkStart w:id="107" w:name="tbl-fit-4f-2or"/>
           <w:p>
             <w:pPr>
               <w:jc w:val="center"/>
             </w:pPr>
             <w:pPr>
-              <w:jc w:val="start"/>
+              <w:jc w:val="left"/>
               <w:spacing w:before="200"/>
               <w:pStyle w:val="ImageCaption"/>
             </w:pPr>
@@ -22603,37 +21927,11 @@
               </w:tc>
             </w:tr>
           </w:tbl>
-          <w:bookmarkEnd w:id="108"/>
+          <w:bookmarkEnd w:id="107"/>
           <w:p/>
         </w:tc>
       </w:tr>
     </w:tbl>
-    <w:p>
-      <w:pPr>
-        <w:pStyle w:val="BodyText"/>
-      </w:pPr>
-      <w:r>
-        <w:rPr>
-          <w:vertAlign w:val="subscript"/>
-        </w:rPr>
-        <w:t xml:space="preserve">Source:</w:t>
-      </w:r>
-      <w:r>
-        <w:rPr>
-          <w:vertAlign w:val="subscript"/>
-        </w:rPr>
-        <w:t xml:space="preserve"> </w:t>
-      </w:r>
-      <w:hyperlink r:id="rId25">
-        <w:r>
-          <w:rPr>
-            <w:rStyle w:val="Hyperlink"/>
-            <w:vertAlign w:val="subscript"/>
-          </w:rPr>
-          <w:t xml:space="preserve">Article Notebook</w:t>
-        </w:r>
-      </w:hyperlink>
-    </w:p>
     <w:p>
       <w:pPr>
         <w:pStyle w:val="BodyText"/>
@@ -22655,13 +21953,13 @@
       <w:tr>
         <w:tc>
           <w:tcPr/>
-          <w:bookmarkStart w:id="109" w:name="tbl-loadings-4f-2or"/>
+          <w:bookmarkStart w:id="108" w:name="tbl-loadings-4f-2or"/>
           <w:p>
             <w:pPr>
               <w:jc w:val="center"/>
             </w:pPr>
             <w:pPr>
-              <w:jc w:val="start"/>
+              <w:jc w:val="left"/>
               <w:spacing w:before="200"/>
               <w:pStyle w:val="ImageCaption"/>
             </w:pPr>
@@ -24562,37 +23860,11 @@
               </w:tc>
             </w:tr>
           </w:tbl>
-          <w:bookmarkEnd w:id="109"/>
+          <w:bookmarkEnd w:id="108"/>
           <w:p/>
         </w:tc>
       </w:tr>
     </w:tbl>
-    <w:p>
-      <w:pPr>
-        <w:pStyle w:val="BodyText"/>
-      </w:pPr>
-      <w:r>
-        <w:rPr>
-          <w:vertAlign w:val="subscript"/>
-        </w:rPr>
-        <w:t xml:space="preserve">Source:</w:t>
-      </w:r>
-      <w:r>
-        <w:rPr>
-          <w:vertAlign w:val="subscript"/>
-        </w:rPr>
-        <w:t xml:space="preserve"> </w:t>
-      </w:r>
-      <w:hyperlink r:id="rId25">
-        <w:r>
-          <w:rPr>
-            <w:rStyle w:val="Hyperlink"/>
-            <w:vertAlign w:val="subscript"/>
-          </w:rPr>
-          <w:t xml:space="preserve">Article Notebook</w:t>
-        </w:r>
-      </w:hyperlink>
-    </w:p>
     <w:p>
       <w:pPr>
         <w:pStyle w:val="BodyText"/>
@@ -24614,13 +23886,13 @@
       <w:tr>
         <w:tc>
           <w:tcPr/>
-          <w:bookmarkStart w:id="110" w:name="tbl-mi-2or"/>
+          <w:bookmarkStart w:id="109" w:name="tbl-mi-2or"/>
           <w:p>
             <w:pPr>
               <w:jc w:val="center"/>
             </w:pPr>
             <w:pPr>
-              <w:jc w:val="start"/>
+              <w:jc w:val="left"/>
               <w:spacing w:before="200"/>
               <w:pStyle w:val="ImageCaption"/>
             </w:pPr>
@@ -26321,38 +25593,12 @@
               </w:tc>
             </w:tr>
           </w:tbl>
-          <w:bookmarkEnd w:id="110"/>
+          <w:bookmarkEnd w:id="109"/>
           <w:p/>
         </w:tc>
       </w:tr>
     </w:tbl>
-    <w:p>
-      <w:pPr>
-        <w:pStyle w:val="BodyText"/>
-      </w:pPr>
-      <w:r>
-        <w:rPr>
-          <w:vertAlign w:val="subscript"/>
-        </w:rPr>
-        <w:t xml:space="preserve">Source:</w:t>
-      </w:r>
-      <w:r>
-        <w:rPr>
-          <w:vertAlign w:val="subscript"/>
-        </w:rPr>
-        <w:t xml:space="preserve"> </w:t>
-      </w:r>
-      <w:hyperlink r:id="rId25">
-        <w:r>
-          <w:rPr>
-            <w:rStyle w:val="Hyperlink"/>
-            <w:vertAlign w:val="subscript"/>
-          </w:rPr>
-          <w:t xml:space="preserve">Article Notebook</w:t>
-        </w:r>
-      </w:hyperlink>
-    </w:p>
-    <w:bookmarkStart w:id="115" w:name="cell-fig-residuals-4f-2or"/>
+    <w:bookmarkStart w:id="114" w:name="cell-fig-residuals-4f-2or"/>
     <w:tbl>
       <w:tblPr>
         <w:tblStyle w:val="Table"/>
@@ -26366,7 +25612,7 @@
       <w:tr>
         <w:tc>
           <w:tcPr/>
-          <w:bookmarkStart w:id="114" w:name="fig-residuals-4f-2or"/>
+          <w:bookmarkStart w:id="113" w:name="fig-residuals-4f-2or"/>
           <w:p>
             <w:pPr>
               <w:pStyle w:val="Compact"/>
@@ -26377,18 +25623,18 @@
                 <wp:inline>
                   <wp:extent cx="5334000" cy="4667250"/>
                   <wp:effectExtent b="0" l="0" r="0" t="0"/>
-                  <wp:docPr descr="" title="" id="112" name="Picture"/>
+                  <wp:docPr descr="" title="" id="111" name="Picture"/>
                   <a:graphic>
                     <a:graphicData uri="http://schemas.openxmlformats.org/drawingml/2006/picture">
                       <pic:pic>
                         <pic:nvPicPr>
-                          <pic:cNvPr descr="index_files/figure-docx/fig-residuals-4f-2or-1.png" id="113" name="Picture"/>
+                          <pic:cNvPr descr="index_files/figure-docx/fig-residuals-4f-2or-1.png" id="112" name="Picture"/>
                           <pic:cNvPicPr>
                             <a:picLocks noChangeArrowheads="1" noChangeAspect="1"/>
                           </pic:cNvPicPr>
                         </pic:nvPicPr>
                         <pic:blipFill>
-                          <a:blip r:embed="rId111"/>
+                          <a:blip r:embed="rId110"/>
                           <a:stretch>
                             <a:fillRect/>
                           </a:stretch>
@@ -26420,7 +25666,7 @@
               <w:jc w:val="center"/>
             </w:pPr>
             <w:pPr>
-              <w:jc w:val="start"/>
+              <w:jc w:val="left"/>
               <w:spacing w:before="200"/>
               <w:pStyle w:val="ImageCaption"/>
             </w:pPr>
@@ -26428,38 +25674,12 @@
               <w:t xml:space="preserve">Figure 5: Heatmap of standardized residual correlations for the 2nd order 4-factor model</w:t>
             </w:r>
           </w:p>
-          <w:bookmarkEnd w:id="114"/>
+          <w:bookmarkEnd w:id="113"/>
         </w:tc>
       </w:tr>
     </w:tbl>
-    <w:p>
-      <w:pPr>
-        <w:pStyle w:val="BodyText"/>
-      </w:pPr>
-      <w:r>
-        <w:rPr>
-          <w:vertAlign w:val="subscript"/>
-        </w:rPr>
-        <w:t xml:space="preserve">Source:</w:t>
-      </w:r>
-      <w:r>
-        <w:rPr>
-          <w:vertAlign w:val="subscript"/>
-        </w:rPr>
-        <w:t xml:space="preserve"> </w:t>
-      </w:r>
-      <w:hyperlink r:id="rId25">
-        <w:r>
-          <w:rPr>
-            <w:rStyle w:val="Hyperlink"/>
-            <w:vertAlign w:val="subscript"/>
-          </w:rPr>
-          <w:t xml:space="preserve">Article Notebook</w:t>
-        </w:r>
-      </w:hyperlink>
-    </w:p>
-    <w:bookmarkEnd w:id="115"/>
-    <w:bookmarkStart w:id="118" w:name="reliability-1"/>
+    <w:bookmarkEnd w:id="114"/>
+    <w:bookmarkStart w:id="117" w:name="reliability-1"/>
     <w:p>
       <w:pPr>
         <w:pStyle w:val="Heading4"/>
@@ -26528,13 +25748,13 @@
       <w:tr>
         <w:tc>
           <w:tcPr/>
-          <w:bookmarkStart w:id="116" w:name="tbl-reliability-2or"/>
+          <w:bookmarkStart w:id="115" w:name="tbl-reliability-2or"/>
           <w:p>
             <w:pPr>
               <w:jc w:val="center"/>
             </w:pPr>
             <w:pPr>
-              <w:jc w:val="start"/>
+              <w:jc w:val="left"/>
               <w:spacing w:before="200"/>
               <w:pStyle w:val="ImageCaption"/>
             </w:pPr>
@@ -27023,37 +26243,11 @@
               </w:tc>
             </w:tr>
           </w:tbl>
-          <w:bookmarkEnd w:id="116"/>
+          <w:bookmarkEnd w:id="115"/>
           <w:p/>
         </w:tc>
       </w:tr>
     </w:tbl>
-    <w:p>
-      <w:pPr>
-        <w:pStyle w:val="BodyText"/>
-      </w:pPr>
-      <w:r>
-        <w:rPr>
-          <w:vertAlign w:val="subscript"/>
-        </w:rPr>
-        <w:t xml:space="preserve">Source:</w:t>
-      </w:r>
-      <w:r>
-        <w:rPr>
-          <w:vertAlign w:val="subscript"/>
-        </w:rPr>
-        <w:t xml:space="preserve"> </w:t>
-      </w:r>
-      <w:hyperlink r:id="rId25">
-        <w:r>
-          <w:rPr>
-            <w:rStyle w:val="Hyperlink"/>
-            <w:vertAlign w:val="subscript"/>
-          </w:rPr>
-          <w:t xml:space="preserve">Article Notebook</w:t>
-        </w:r>
-      </w:hyperlink>
-    </w:p>
     <w:p>
       <w:pPr>
         <w:pStyle w:val="BodyText"/>
@@ -27075,13 +26269,13 @@
       <w:tr>
         <w:tc>
           <w:tcPr/>
-          <w:bookmarkStart w:id="117" w:name="tbl-reliability-2or-l2"/>
+          <w:bookmarkStart w:id="116" w:name="tbl-reliability-2or-l2"/>
           <w:p>
             <w:pPr>
               <w:jc w:val="center"/>
             </w:pPr>
             <w:pPr>
-              <w:jc w:val="start"/>
+              <w:jc w:val="left"/>
               <w:spacing w:before="200"/>
               <w:pStyle w:val="ImageCaption"/>
             </w:pPr>
@@ -27186,7 +26380,7 @@
               </w:tc>
             </w:tr>
           </w:tbl>
-          <w:bookmarkEnd w:id="117"/>
+          <w:bookmarkEnd w:id="116"/>
           <w:p/>
         </w:tc>
       </w:tr>
@@ -27196,56 +26390,30 @@
         <w:pStyle w:val="BodyText"/>
       </w:pPr>
       <w:r>
-        <w:rPr>
-          <w:vertAlign w:val="subscript"/>
-        </w:rPr>
-        <w:t xml:space="preserve">Source:</w:t>
-      </w:r>
-      <w:r>
-        <w:rPr>
-          <w:vertAlign w:val="subscript"/>
-        </w:rPr>
+        <w:t xml:space="preserve">The second-order QOL factor shows adequate reliability, indicating that the</w:t>
+      </w:r>
+      <w:r>
         <w:t xml:space="preserve"> </w:t>
       </w:r>
-      <w:hyperlink r:id="rId25">
-        <w:r>
-          <w:rPr>
-            <w:rStyle w:val="Hyperlink"/>
-            <w:vertAlign w:val="subscript"/>
-          </w:rPr>
-          <w:t xml:space="preserve">Article Notebook</w:t>
-        </w:r>
-      </w:hyperlink>
+      <w:r>
+        <w:t xml:space="preserve">four first-order domains collectively serve as reliable indicators of overall</w:t>
+      </w:r>
+      <w:r>
+        <w:t xml:space="preserve"> </w:t>
+      </w:r>
+      <w:r>
+        <w:t xml:space="preserve">quality of life. First-order reliability values remain consistent with those</w:t>
+      </w:r>
+      <w:r>
+        <w:t xml:space="preserve"> </w:t>
+      </w:r>
+      <w:r>
+        <w:t xml:space="preserve">observed in the standard 4-factor model.</w:t>
+      </w:r>
     </w:p>
-    <w:p>
-      <w:pPr>
-        <w:pStyle w:val="BodyText"/>
-      </w:pPr>
-      <w:r>
-        <w:t xml:space="preserve">The second-order QOL factor shows adequate reliability, indicating that the</w:t>
-      </w:r>
-      <w:r>
-        <w:t xml:space="preserve"> </w:t>
-      </w:r>
-      <w:r>
-        <w:t xml:space="preserve">four first-order domains collectively serve as reliable indicators of overall</w:t>
-      </w:r>
-      <w:r>
-        <w:t xml:space="preserve"> </w:t>
-      </w:r>
-      <w:r>
-        <w:t xml:space="preserve">quality of life. First-order reliability values remain consistent with those</w:t>
-      </w:r>
-      <w:r>
-        <w:t xml:space="preserve"> </w:t>
-      </w:r>
-      <w:r>
-        <w:t xml:space="preserve">observed in the standard 4-factor model.</w:t>
-      </w:r>
-    </w:p>
+    <w:bookmarkEnd w:id="117"/>
     <w:bookmarkEnd w:id="118"/>
-    <w:bookmarkEnd w:id="119"/>
-    <w:bookmarkStart w:id="125" w:name="path-diagram-1"/>
+    <w:bookmarkStart w:id="124" w:name="path-diagram-1"/>
     <w:p>
       <w:pPr>
         <w:pStyle w:val="Heading3"/>
@@ -27254,7 +26422,7 @@
         <w:t xml:space="preserve">7.4 Path Diagram</w:t>
       </w:r>
     </w:p>
-    <w:bookmarkStart w:id="124" w:name="cell-fig-diagram-2or"/>
+    <w:bookmarkStart w:id="123" w:name="cell-fig-diagram-2or"/>
     <w:tbl>
       <w:tblPr>
         <w:tblStyle w:val="Table"/>
@@ -27268,7 +26436,7 @@
       <w:tr>
         <w:tc>
           <w:tcPr/>
-          <w:bookmarkStart w:id="123" w:name="fig-diagram-2or"/>
+          <w:bookmarkStart w:id="122" w:name="fig-diagram-2or"/>
           <w:p>
             <w:pPr>
               <w:pStyle w:val="Compact"/>
@@ -27279,18 +26447,18 @@
                 <wp:inline>
                   <wp:extent cx="5334000" cy="6858000"/>
                   <wp:effectExtent b="0" l="0" r="0" t="0"/>
-                  <wp:docPr descr="" title="" id="121" name="Picture"/>
+                  <wp:docPr descr="" title="" id="120" name="Picture"/>
                   <a:graphic>
                     <a:graphicData uri="http://schemas.openxmlformats.org/drawingml/2006/picture">
                       <pic:pic>
                         <pic:nvPicPr>
-                          <pic:cNvPr descr="index_files/figure-docx/fig-diagram-2or-1.png" id="122" name="Picture"/>
+                          <pic:cNvPr descr="index_files/figure-docx/fig-diagram-2or-1.png" id="121" name="Picture"/>
                           <pic:cNvPicPr>
                             <a:picLocks noChangeArrowheads="1" noChangeAspect="1"/>
                           </pic:cNvPicPr>
                         </pic:nvPicPr>
                         <pic:blipFill>
-                          <a:blip r:embed="rId120"/>
+                          <a:blip r:embed="rId119"/>
                           <a:stretch>
                             <a:fillRect/>
                           </a:stretch>
@@ -27322,7 +26490,7 @@
               <w:jc w:val="center"/>
             </w:pPr>
             <w:pPr>
-              <w:jc w:val="start"/>
+              <w:jc w:val="left"/>
               <w:spacing w:before="200"/>
               <w:pStyle w:val="ImageCaption"/>
             </w:pPr>
@@ -27330,40 +26498,14 @@
               <w:t xml:space="preserve">Figure 6: Path diagram of the second-order CFA model</w:t>
             </w:r>
           </w:p>
-          <w:bookmarkEnd w:id="123"/>
+          <w:bookmarkEnd w:id="122"/>
         </w:tc>
       </w:tr>
     </w:tbl>
-    <w:p>
-      <w:pPr>
-        <w:pStyle w:val="BodyText"/>
-      </w:pPr>
-      <w:r>
-        <w:rPr>
-          <w:vertAlign w:val="subscript"/>
-        </w:rPr>
-        <w:t xml:space="preserve">Source:</w:t>
-      </w:r>
-      <w:r>
-        <w:rPr>
-          <w:vertAlign w:val="subscript"/>
-        </w:rPr>
-        <w:t xml:space="preserve"> </w:t>
-      </w:r>
-      <w:hyperlink r:id="rId25">
-        <w:r>
-          <w:rPr>
-            <w:rStyle w:val="Hyperlink"/>
-            <w:vertAlign w:val="subscript"/>
-          </w:rPr>
-          <w:t xml:space="preserve">Article Notebook</w:t>
-        </w:r>
-      </w:hyperlink>
-    </w:p>
+    <w:bookmarkEnd w:id="123"/>
     <w:bookmarkEnd w:id="124"/>
     <w:bookmarkEnd w:id="125"/>
-    <w:bookmarkEnd w:id="126"/>
-    <w:bookmarkStart w:id="146" w:name="sec-4fb"/>
+    <w:bookmarkStart w:id="145" w:name="sec-4fb"/>
     <w:p>
       <w:pPr>
         <w:pStyle w:val="Heading2"/>
@@ -27437,7 +26579,7 @@
         <w:t xml:space="preserve">context.</w:t>
       </w:r>
     </w:p>
-    <w:bookmarkStart w:id="127" w:name="model-specification-3"/>
+    <w:bookmarkStart w:id="126" w:name="model-specification-3"/>
     <w:p>
       <w:pPr>
         <w:pStyle w:val="Heading3"/>
@@ -27466,34 +26608,8 @@
         <w:t xml:space="preserve">the final model comparison and post hoc power analysis.</w:t>
       </w:r>
     </w:p>
-    <w:p>
-      <w:pPr>
-        <w:pStyle w:val="BodyText"/>
-      </w:pPr>
-      <w:r>
-        <w:rPr>
-          <w:vertAlign w:val="subscript"/>
-        </w:rPr>
-        <w:t xml:space="preserve">Source:</w:t>
-      </w:r>
-      <w:r>
-        <w:rPr>
-          <w:vertAlign w:val="subscript"/>
-        </w:rPr>
-        <w:t xml:space="preserve"> </w:t>
-      </w:r>
-      <w:hyperlink r:id="rId25">
-        <w:r>
-          <w:rPr>
-            <w:rStyle w:val="Hyperlink"/>
-            <w:vertAlign w:val="subscript"/>
-          </w:rPr>
-          <w:t xml:space="preserve">Article Notebook</w:t>
-        </w:r>
-      </w:hyperlink>
-    </w:p>
-    <w:bookmarkEnd w:id="127"/>
-    <w:bookmarkStart w:id="128" w:name="model-estimation-3"/>
+    <w:bookmarkEnd w:id="126"/>
+    <w:bookmarkStart w:id="127" w:name="model-estimation-3"/>
     <w:p>
       <w:pPr>
         <w:pStyle w:val="Heading3"/>
@@ -27502,34 +26618,8 @@
         <w:t xml:space="preserve">8.2 Model Estimation</w:t>
       </w:r>
     </w:p>
-    <w:p>
-      <w:pPr>
-        <w:pStyle w:val="FirstParagraph"/>
-      </w:pPr>
-      <w:r>
-        <w:rPr>
-          <w:vertAlign w:val="subscript"/>
-        </w:rPr>
-        <w:t xml:space="preserve">Source:</w:t>
-      </w:r>
-      <w:r>
-        <w:rPr>
-          <w:vertAlign w:val="subscript"/>
-        </w:rPr>
-        <w:t xml:space="preserve"> </w:t>
-      </w:r>
-      <w:hyperlink r:id="rId25">
-        <w:r>
-          <w:rPr>
-            <w:rStyle w:val="Hyperlink"/>
-            <w:vertAlign w:val="subscript"/>
-          </w:rPr>
-          <w:t xml:space="preserve">Article Notebook</w:t>
-        </w:r>
-      </w:hyperlink>
-    </w:p>
-    <w:bookmarkEnd w:id="128"/>
-    <w:bookmarkStart w:id="139" w:name="model-evaluation-2"/>
+    <w:bookmarkEnd w:id="127"/>
+    <w:bookmarkStart w:id="138" w:name="model-evaluation-2"/>
     <w:p>
       <w:pPr>
         <w:pStyle w:val="Heading3"/>
@@ -27551,13 +26641,13 @@
       <w:tr>
         <w:tc>
           <w:tcPr/>
-          <w:bookmarkStart w:id="129" w:name="tbl-fit-4fb"/>
+          <w:bookmarkStart w:id="128" w:name="tbl-fit-4fb"/>
           <w:p>
             <w:pPr>
               <w:jc w:val="center"/>
             </w:pPr>
             <w:pPr>
-              <w:jc w:val="start"/>
+              <w:jc w:val="left"/>
               <w:spacing w:before="200"/>
               <w:pStyle w:val="ImageCaption"/>
             </w:pPr>
@@ -27797,37 +26887,11 @@
               </w:tc>
             </w:tr>
           </w:tbl>
-          <w:bookmarkEnd w:id="129"/>
+          <w:bookmarkEnd w:id="128"/>
           <w:p/>
         </w:tc>
       </w:tr>
     </w:tbl>
-    <w:p>
-      <w:pPr>
-        <w:pStyle w:val="BodyText"/>
-      </w:pPr>
-      <w:r>
-        <w:rPr>
-          <w:vertAlign w:val="subscript"/>
-        </w:rPr>
-        <w:t xml:space="preserve">Source:</w:t>
-      </w:r>
-      <w:r>
-        <w:rPr>
-          <w:vertAlign w:val="subscript"/>
-        </w:rPr>
-        <w:t xml:space="preserve"> </w:t>
-      </w:r>
-      <w:hyperlink r:id="rId25">
-        <w:r>
-          <w:rPr>
-            <w:rStyle w:val="Hyperlink"/>
-            <w:vertAlign w:val="subscript"/>
-          </w:rPr>
-          <w:t xml:space="preserve">Article Notebook</w:t>
-        </w:r>
-      </w:hyperlink>
-    </w:p>
     <w:p>
       <w:pPr>
         <w:pStyle w:val="BodyText"/>
@@ -27849,13 +26913,13 @@
       <w:tr>
         <w:tc>
           <w:tcPr/>
-          <w:bookmarkStart w:id="130" w:name="tbl-loadings-4fb"/>
+          <w:bookmarkStart w:id="129" w:name="tbl-loadings-4fb"/>
           <w:p>
             <w:pPr>
               <w:jc w:val="center"/>
             </w:pPr>
             <w:pPr>
-              <w:jc w:val="start"/>
+              <w:jc w:val="left"/>
               <w:spacing w:before="200"/>
               <w:pStyle w:val="ImageCaption"/>
             </w:pPr>
@@ -29488,37 +28552,11 @@
               </w:tc>
             </w:tr>
           </w:tbl>
-          <w:bookmarkEnd w:id="130"/>
+          <w:bookmarkEnd w:id="129"/>
           <w:p/>
         </w:tc>
       </w:tr>
     </w:tbl>
-    <w:p>
-      <w:pPr>
-        <w:pStyle w:val="BodyText"/>
-      </w:pPr>
-      <w:r>
-        <w:rPr>
-          <w:vertAlign w:val="subscript"/>
-        </w:rPr>
-        <w:t xml:space="preserve">Source:</w:t>
-      </w:r>
-      <w:r>
-        <w:rPr>
-          <w:vertAlign w:val="subscript"/>
-        </w:rPr>
-        <w:t xml:space="preserve"> </w:t>
-      </w:r>
-      <w:hyperlink r:id="rId25">
-        <w:r>
-          <w:rPr>
-            <w:rStyle w:val="Hyperlink"/>
-            <w:vertAlign w:val="subscript"/>
-          </w:rPr>
-          <w:t xml:space="preserve">Article Notebook</w:t>
-        </w:r>
-      </w:hyperlink>
-    </w:p>
     <w:p>
       <w:pPr>
         <w:pStyle w:val="BodyText"/>
@@ -29540,13 +28578,13 @@
       <w:tr>
         <w:tc>
           <w:tcPr/>
-          <w:bookmarkStart w:id="131" w:name="tbl-cor-4fb"/>
+          <w:bookmarkStart w:id="130" w:name="tbl-cor-4fb"/>
           <w:p>
             <w:pPr>
               <w:jc w:val="center"/>
             </w:pPr>
             <w:pPr>
-              <w:jc w:val="start"/>
+              <w:jc w:val="left"/>
               <w:spacing w:before="200"/>
               <w:pStyle w:val="ImageCaption"/>
             </w:pPr>
@@ -30040,37 +29078,11 @@
               </w:tc>
             </w:tr>
           </w:tbl>
-          <w:bookmarkEnd w:id="131"/>
+          <w:bookmarkEnd w:id="130"/>
           <w:p/>
         </w:tc>
       </w:tr>
     </w:tbl>
-    <w:p>
-      <w:pPr>
-        <w:pStyle w:val="BodyText"/>
-      </w:pPr>
-      <w:r>
-        <w:rPr>
-          <w:vertAlign w:val="subscript"/>
-        </w:rPr>
-        <w:t xml:space="preserve">Source:</w:t>
-      </w:r>
-      <w:r>
-        <w:rPr>
-          <w:vertAlign w:val="subscript"/>
-        </w:rPr>
-        <w:t xml:space="preserve"> </w:t>
-      </w:r>
-      <w:hyperlink r:id="rId25">
-        <w:r>
-          <w:rPr>
-            <w:rStyle w:val="Hyperlink"/>
-            <w:vertAlign w:val="subscript"/>
-          </w:rPr>
-          <w:t xml:space="preserve">Article Notebook</w:t>
-        </w:r>
-      </w:hyperlink>
-    </w:p>
     <w:p>
       <w:pPr>
         <w:pStyle w:val="BodyText"/>
@@ -30110,13 +29122,13 @@
       <w:tr>
         <w:tc>
           <w:tcPr/>
-          <w:bookmarkStart w:id="132" w:name="tbl-mi-4fb"/>
+          <w:bookmarkStart w:id="131" w:name="tbl-mi-4fb"/>
           <w:p>
             <w:pPr>
               <w:jc w:val="center"/>
             </w:pPr>
             <w:pPr>
-              <w:jc w:val="start"/>
+              <w:jc w:val="left"/>
               <w:spacing w:before="200"/>
               <w:pStyle w:val="ImageCaption"/>
             </w:pPr>
@@ -31817,7 +30829,7 @@
               </w:tc>
             </w:tr>
           </w:tbl>
-          <w:bookmarkEnd w:id="132"/>
+          <w:bookmarkEnd w:id="131"/>
           <w:p/>
         </w:tc>
       </w:tr>
@@ -31827,48 +30839,22 @@
         <w:pStyle w:val="BodyText"/>
       </w:pPr>
       <w:r>
-        <w:rPr>
-          <w:vertAlign w:val="subscript"/>
-        </w:rPr>
-        <w:t xml:space="preserve">Source:</w:t>
-      </w:r>
-      <w:r>
-        <w:rPr>
-          <w:vertAlign w:val="subscript"/>
-        </w:rPr>
+        <w:t xml:space="preserve">The modification indices are notably reduced compared to the original model.</w:t>
+      </w:r>
+      <w:r>
         <w:t xml:space="preserve"> </w:t>
       </w:r>
-      <w:hyperlink r:id="rId25">
-        <w:r>
-          <w:rPr>
-            <w:rStyle w:val="Hyperlink"/>
-            <w:vertAlign w:val="subscript"/>
-          </w:rPr>
-          <w:t xml:space="preserve">Article Notebook</w:t>
-        </w:r>
-      </w:hyperlink>
+      <w:r>
+        <w:t xml:space="preserve">While some MIs remain above 3.84, they are smaller in magnitude and do not</w:t>
+      </w:r>
+      <w:r>
+        <w:t xml:space="preserve"> </w:t>
+      </w:r>
+      <w:r>
+        <w:t xml:space="preserve">show the systematic pattern of misfit associated with Q5.</w:t>
+      </w:r>
     </w:p>
-    <w:p>
-      <w:pPr>
-        <w:pStyle w:val="BodyText"/>
-      </w:pPr>
-      <w:r>
-        <w:t xml:space="preserve">The modification indices are notably reduced compared to the original model.</w:t>
-      </w:r>
-      <w:r>
-        <w:t xml:space="preserve"> </w:t>
-      </w:r>
-      <w:r>
-        <w:t xml:space="preserve">While some MIs remain above 3.84, they are smaller in magnitude and do not</w:t>
-      </w:r>
-      <w:r>
-        <w:t xml:space="preserve"> </w:t>
-      </w:r>
-      <w:r>
-        <w:t xml:space="preserve">show the systematic pattern of misfit associated with Q5.</w:t>
-      </w:r>
-    </w:p>
-    <w:bookmarkStart w:id="137" w:name="cell-fig-residuals-4fb"/>
+    <w:bookmarkStart w:id="136" w:name="cell-fig-residuals-4fb"/>
     <w:tbl>
       <w:tblPr>
         <w:tblStyle w:val="Table"/>
@@ -31882,7 +30868,7 @@
       <w:tr>
         <w:tc>
           <w:tcPr/>
-          <w:bookmarkStart w:id="136" w:name="fig-residuals-4fb"/>
+          <w:bookmarkStart w:id="135" w:name="fig-residuals-4fb"/>
           <w:p>
             <w:pPr>
               <w:pStyle w:val="Compact"/>
@@ -31893,18 +30879,18 @@
                 <wp:inline>
                   <wp:extent cx="5334000" cy="4667250"/>
                   <wp:effectExtent b="0" l="0" r="0" t="0"/>
-                  <wp:docPr descr="" title="" id="134" name="Picture"/>
+                  <wp:docPr descr="" title="" id="133" name="Picture"/>
                   <a:graphic>
                     <a:graphicData uri="http://schemas.openxmlformats.org/drawingml/2006/picture">
                       <pic:pic>
                         <pic:nvPicPr>
-                          <pic:cNvPr descr="index_files/figure-docx/fig-residuals-4fb-1.png" id="135" name="Picture"/>
+                          <pic:cNvPr descr="index_files/figure-docx/fig-residuals-4fb-1.png" id="134" name="Picture"/>
                           <pic:cNvPicPr>
                             <a:picLocks noChangeArrowheads="1" noChangeAspect="1"/>
                           </pic:cNvPicPr>
                         </pic:nvPicPr>
                         <pic:blipFill>
-                          <a:blip r:embed="rId133"/>
+                          <a:blip r:embed="rId132"/>
                           <a:stretch>
                             <a:fillRect/>
                           </a:stretch>
@@ -31936,7 +30922,7 @@
               <w:jc w:val="center"/>
             </w:pPr>
             <w:pPr>
-              <w:jc w:val="start"/>
+              <w:jc w:val="left"/>
               <w:spacing w:before="200"/>
               <w:pStyle w:val="ImageCaption"/>
             </w:pPr>
@@ -31944,37 +30930,11 @@
               <w:t xml:space="preserve">Figure 7: Heatmap of standardized residual correlations for the 4-factor model (Q5 excluded)</w:t>
             </w:r>
           </w:p>
-          <w:bookmarkEnd w:id="136"/>
+          <w:bookmarkEnd w:id="135"/>
         </w:tc>
       </w:tr>
     </w:tbl>
-    <w:p>
-      <w:pPr>
-        <w:pStyle w:val="BodyText"/>
-      </w:pPr>
-      <w:r>
-        <w:rPr>
-          <w:vertAlign w:val="subscript"/>
-        </w:rPr>
-        <w:t xml:space="preserve">Source:</w:t>
-      </w:r>
-      <w:r>
-        <w:rPr>
-          <w:vertAlign w:val="subscript"/>
-        </w:rPr>
-        <w:t xml:space="preserve"> </w:t>
-      </w:r>
-      <w:hyperlink r:id="rId25">
-        <w:r>
-          <w:rPr>
-            <w:rStyle w:val="Hyperlink"/>
-            <w:vertAlign w:val="subscript"/>
-          </w:rPr>
-          <w:t xml:space="preserve">Article Notebook</w:t>
-        </w:r>
-      </w:hyperlink>
-    </w:p>
-    <w:bookmarkEnd w:id="137"/>
+    <w:bookmarkEnd w:id="136"/>
     <w:tbl>
       <w:tblPr>
         <w:tblStyle w:val="Table"/>
@@ -31988,13 +30948,13 @@
       <w:tr>
         <w:tc>
           <w:tcPr/>
-          <w:bookmarkStart w:id="138" w:name="tbl-reliability-4fb"/>
+          <w:bookmarkStart w:id="137" w:name="tbl-reliability-4fb"/>
           <w:p>
             <w:pPr>
               <w:jc w:val="center"/>
             </w:pPr>
             <w:pPr>
-              <w:jc w:val="start"/>
+              <w:jc w:val="left"/>
               <w:spacing w:before="200"/>
               <w:pStyle w:val="ImageCaption"/>
             </w:pPr>
@@ -32483,7 +31443,7 @@
               </w:tc>
             </w:tr>
           </w:tbl>
-          <w:bookmarkEnd w:id="138"/>
+          <w:bookmarkEnd w:id="137"/>
           <w:p/>
         </w:tc>
       </w:tr>
@@ -32493,61 +31453,35 @@
         <w:pStyle w:val="BodyText"/>
       </w:pPr>
       <w:r>
-        <w:rPr>
-          <w:vertAlign w:val="subscript"/>
-        </w:rPr>
-        <w:t xml:space="preserve">Source:</w:t>
-      </w:r>
-      <w:r>
-        <w:rPr>
-          <w:vertAlign w:val="subscript"/>
-        </w:rPr>
+        <w:t xml:space="preserve">Reliability for the Psychological domain remains adequate even after removing</w:t>
+      </w:r>
+      <w:r>
         <w:t xml:space="preserve"> </w:t>
       </w:r>
-      <w:hyperlink r:id="rId25">
-        <w:r>
-          <w:rPr>
-            <w:rStyle w:val="Hyperlink"/>
-            <w:vertAlign w:val="subscript"/>
-          </w:rPr>
-          <w:t xml:space="preserve">Article Notebook</w:t>
-        </w:r>
-      </w:hyperlink>
+      <w:r>
+        <w:t xml:space="preserve">Q5, confirming that the item was not essential for capturing the construct. The</w:t>
+      </w:r>
+      <w:r>
+        <w:t xml:space="preserve"> </w:t>
+      </w:r>
+      <w:r>
+        <w:t xml:space="preserve">remaining five items (Q6, Q7, Q11, Q19, Q26) provide a reliable measurement</w:t>
+      </w:r>
+      <w:r>
+        <w:t xml:space="preserve"> </w:t>
+      </w:r>
+      <w:r>
+        <w:t xml:space="preserve">of psychological well-being. All other domains maintain their previous</w:t>
+      </w:r>
+      <w:r>
+        <w:t xml:space="preserve"> </w:t>
+      </w:r>
+      <w:r>
+        <w:t xml:space="preserve">reliability levels.</w:t>
+      </w:r>
     </w:p>
-    <w:p>
-      <w:pPr>
-        <w:pStyle w:val="BodyText"/>
-      </w:pPr>
-      <w:r>
-        <w:t xml:space="preserve">Reliability for the Psychological domain remains adequate even after removing</w:t>
-      </w:r>
-      <w:r>
-        <w:t xml:space="preserve"> </w:t>
-      </w:r>
-      <w:r>
-        <w:t xml:space="preserve">Q5, confirming that the item was not essential for capturing the construct. The</w:t>
-      </w:r>
-      <w:r>
-        <w:t xml:space="preserve"> </w:t>
-      </w:r>
-      <w:r>
-        <w:t xml:space="preserve">remaining five items (Q6, Q7, Q11, Q19, Q26) provide a reliable measurement</w:t>
-      </w:r>
-      <w:r>
-        <w:t xml:space="preserve"> </w:t>
-      </w:r>
-      <w:r>
-        <w:t xml:space="preserve">of psychological well-being. All other domains maintain their previous</w:t>
-      </w:r>
-      <w:r>
-        <w:t xml:space="preserve"> </w:t>
-      </w:r>
-      <w:r>
-        <w:t xml:space="preserve">reliability levels.</w:t>
-      </w:r>
-    </w:p>
-    <w:bookmarkEnd w:id="139"/>
-    <w:bookmarkStart w:id="145" w:name="path-diagram-2"/>
+    <w:bookmarkEnd w:id="138"/>
+    <w:bookmarkStart w:id="144" w:name="path-diagram-2"/>
     <w:p>
       <w:pPr>
         <w:pStyle w:val="Heading3"/>
@@ -32556,7 +31490,7 @@
         <w:t xml:space="preserve">8.4 Path Diagram</w:t>
       </w:r>
     </w:p>
-    <w:bookmarkStart w:id="144" w:name="cell-fig-diagram-4fb"/>
+    <w:bookmarkStart w:id="143" w:name="cell-fig-diagram-4fb"/>
     <w:tbl>
       <w:tblPr>
         <w:tblStyle w:val="Table"/>
@@ -32570,7 +31504,7 @@
       <w:tr>
         <w:tc>
           <w:tcPr/>
-          <w:bookmarkStart w:id="143" w:name="fig-diagram-4fb"/>
+          <w:bookmarkStart w:id="142" w:name="fig-diagram-4fb"/>
           <w:p>
             <w:pPr>
               <w:pStyle w:val="Compact"/>
@@ -32581,18 +31515,18 @@
                 <wp:inline>
                   <wp:extent cx="5334000" cy="5334000"/>
                   <wp:effectExtent b="0" l="0" r="0" t="0"/>
-                  <wp:docPr descr="" title="" id="141" name="Picture"/>
+                  <wp:docPr descr="" title="" id="140" name="Picture"/>
                   <a:graphic>
                     <a:graphicData uri="http://schemas.openxmlformats.org/drawingml/2006/picture">
                       <pic:pic>
                         <pic:nvPicPr>
-                          <pic:cNvPr descr="index_files/figure-docx/fig-diagram-4fb-1.png" id="142" name="Picture"/>
+                          <pic:cNvPr descr="index_files/figure-docx/fig-diagram-4fb-1.png" id="141" name="Picture"/>
                           <pic:cNvPicPr>
                             <a:picLocks noChangeArrowheads="1" noChangeAspect="1"/>
                           </pic:cNvPicPr>
                         </pic:nvPicPr>
                         <pic:blipFill>
-                          <a:blip r:embed="rId140"/>
+                          <a:blip r:embed="rId139"/>
                           <a:stretch>
                             <a:fillRect/>
                           </a:stretch>
@@ -32624,7 +31558,7 @@
               <w:jc w:val="center"/>
             </w:pPr>
             <w:pPr>
-              <w:jc w:val="start"/>
+              <w:jc w:val="left"/>
               <w:spacing w:before="200"/>
               <w:pStyle w:val="ImageCaption"/>
             </w:pPr>
@@ -32632,40 +31566,14 @@
               <w:t xml:space="preserve">Figure 8: Path diagram of the revised 4-factor CFA model (without Q5)</w:t>
             </w:r>
           </w:p>
-          <w:bookmarkEnd w:id="143"/>
+          <w:bookmarkEnd w:id="142"/>
         </w:tc>
       </w:tr>
     </w:tbl>
-    <w:p>
-      <w:pPr>
-        <w:pStyle w:val="BodyText"/>
-      </w:pPr>
-      <w:r>
-        <w:rPr>
-          <w:vertAlign w:val="subscript"/>
-        </w:rPr>
-        <w:t xml:space="preserve">Source:</w:t>
-      </w:r>
-      <w:r>
-        <w:rPr>
-          <w:vertAlign w:val="subscript"/>
-        </w:rPr>
-        <w:t xml:space="preserve"> </w:t>
-      </w:r>
-      <w:hyperlink r:id="rId25">
-        <w:r>
-          <w:rPr>
-            <w:rStyle w:val="Hyperlink"/>
-            <w:vertAlign w:val="subscript"/>
-          </w:rPr>
-          <w:t xml:space="preserve">Article Notebook</w:t>
-        </w:r>
-      </w:hyperlink>
-    </w:p>
+    <w:bookmarkEnd w:id="143"/>
     <w:bookmarkEnd w:id="144"/>
     <w:bookmarkEnd w:id="145"/>
-    <w:bookmarkEnd w:id="146"/>
-    <w:bookmarkStart w:id="150" w:name="sec-comparison"/>
+    <w:bookmarkStart w:id="149" w:name="sec-comparison"/>
     <w:p>
       <w:pPr>
         <w:pStyle w:val="Heading2"/>
@@ -32705,32 +31613,6 @@
       <w:r>
         <w:t xml:space="preserve">baseline independence model.</w:t>
       </w:r>
-    </w:p>
-    <w:p>
-      <w:pPr>
-        <w:pStyle w:val="BodyText"/>
-      </w:pPr>
-      <w:r>
-        <w:rPr>
-          <w:vertAlign w:val="subscript"/>
-        </w:rPr>
-        <w:t xml:space="preserve">Source:</w:t>
-      </w:r>
-      <w:r>
-        <w:rPr>
-          <w:vertAlign w:val="subscript"/>
-        </w:rPr>
-        <w:t xml:space="preserve"> </w:t>
-      </w:r>
-      <w:hyperlink r:id="rId25">
-        <w:r>
-          <w:rPr>
-            <w:rStyle w:val="Hyperlink"/>
-            <w:vertAlign w:val="subscript"/>
-          </w:rPr>
-          <w:t xml:space="preserve">Article Notebook</w:t>
-        </w:r>
-      </w:hyperlink>
     </w:p>
     <w:tbl>
       <w:tblPr>
@@ -32745,13 +31627,13 @@
       <w:tr>
         <w:tc>
           <w:tcPr/>
-          <w:bookmarkStart w:id="147" w:name="tbl-model-comparison"/>
+          <w:bookmarkStart w:id="146" w:name="tbl-model-comparison"/>
           <w:p>
             <w:pPr>
               <w:jc w:val="center"/>
             </w:pPr>
             <w:pPr>
-              <w:jc w:val="start"/>
+              <w:jc w:val="left"/>
               <w:spacing w:before="200"/>
               <w:pStyle w:val="ImageCaption"/>
             </w:pPr>
@@ -33045,37 +31927,11 @@
               </w:tc>
             </w:tr>
           </w:tbl>
-          <w:bookmarkEnd w:id="147"/>
+          <w:bookmarkEnd w:id="146"/>
           <w:p/>
         </w:tc>
       </w:tr>
     </w:tbl>
-    <w:p>
-      <w:pPr>
-        <w:pStyle w:val="BodyText"/>
-      </w:pPr>
-      <w:r>
-        <w:rPr>
-          <w:vertAlign w:val="subscript"/>
-        </w:rPr>
-        <w:t xml:space="preserve">Source:</w:t>
-      </w:r>
-      <w:r>
-        <w:rPr>
-          <w:vertAlign w:val="subscript"/>
-        </w:rPr>
-        <w:t xml:space="preserve"> </w:t>
-      </w:r>
-      <w:hyperlink r:id="rId25">
-        <w:r>
-          <w:rPr>
-            <w:rStyle w:val="Hyperlink"/>
-            <w:vertAlign w:val="subscript"/>
-          </w:rPr>
-          <w:t xml:space="preserve">Article Notebook</w:t>
-        </w:r>
-      </w:hyperlink>
-    </w:p>
     <w:p>
       <w:pPr>
         <w:pStyle w:val="BodyText"/>
@@ -33163,17 +32019,16 @@
         <w:tblStyle w:val="Table"/>
         <w:tblLook w:firstRow="0" w:lastRow="0" w:firstColumn="0" w:lastColumn="0" w:noHBand="0" w:noVBand="0" w:val="0000"/>
         <w:tblBorders>
+          <w:top w:val="single" w:sz="4" w:space="0" w:color="CC1914"/>
           <w:left w:val="single" w:sz="24" w:space="0" w:color="CC1914"/>
+          <w:bottom w:val="single" w:sz="4" w:space="0" w:color="CC1914"/>
           <w:right w:val="single" w:sz="4" w:space="0" w:color="CC1914"/>
-          <w:top w:val="single" w:sz="4" w:space="0" w:color="CC1914"/>
-          <w:bottom w:val="single" w:sz="4" w:space="0" w:color="CC1914"/>
         </w:tblBorders>
         <w:tblCellMar>
           <w:left w:w="144" w:type="dxa"/>
           <w:right w:w="144" w:type="dxa"/>
         </w:tblCellMar>
-        <w:tblInd w:w="164" w:type="dxa"/>
-        <w:tblW w:type="pct" w:w="100%"/>
+        <w:tblLook w:firstRow="0" w:lastRow="0" w:firstColumn="0" w:lastColumn="0" w:noHBand="0" w:noVBand="0" w:val="0000"/>
       </w:tblPr>
       <w:tr>
         <w:trPr>
@@ -33200,12 +32055,12 @@
                 <wp:inline>
                   <wp:extent cx="152400" cy="152400"/>
                   <wp:effectExtent b="0" l="0" r="0" t="0"/>
-                  <wp:docPr descr="" title="" id="148" name="Picture"/>
+                  <wp:docPr descr="" title="" id="147" name="Picture"/>
                   <a:graphic>
                     <a:graphicData uri="http://schemas.openxmlformats.org/drawingml/2006/picture">
                       <pic:pic>
                         <pic:nvPicPr>
-                          <pic:cNvPr descr="C:\Program Files\RStudio\resources\app\bin\quarto\share\formats\docx\important.png" id="149" name="Picture"/>
+                          <pic:cNvPr descr="C:\Program Files\RStudio\resources\app\bin\quarto\share\formats\docx\important.png" id="148" name="Picture"/>
                           <pic:cNvPicPr>
                             <a:picLocks noChangeArrowheads="1" noChangeAspect="1"/>
                           </pic:cNvPicPr>
@@ -33413,11 +32268,12 @@
               <w:t xml:space="preserve">Is the most parsimonious adequate representation of the data</w:t>
             </w:r>
           </w:p>
+          <w:p/>
         </w:tc>
       </w:tr>
     </w:tbl>
-    <w:bookmarkEnd w:id="150"/>
-    <w:bookmarkStart w:id="178" w:name="sec-power"/>
+    <w:bookmarkEnd w:id="149"/>
+    <w:bookmarkStart w:id="177" w:name="sec-power"/>
     <w:p>
       <w:pPr>
         <w:pStyle w:val="Heading2"/>
@@ -33478,17 +32334,16 @@
         <w:tblStyle w:val="Table"/>
         <w:tblLook w:firstRow="0" w:lastRow="0" w:firstColumn="0" w:lastColumn="0" w:noHBand="0" w:noVBand="0" w:val="0000"/>
         <w:tblBorders>
+          <w:top w:val="single" w:sz="4" w:space="0" w:color="0758E5"/>
           <w:left w:val="single" w:sz="24" w:space="0" w:color="0758E5"/>
+          <w:bottom w:val="single" w:sz="4" w:space="0" w:color="0758E5"/>
           <w:right w:val="single" w:sz="4" w:space="0" w:color="0758E5"/>
-          <w:top w:val="single" w:sz="4" w:space="0" w:color="0758E5"/>
-          <w:bottom w:val="single" w:sz="4" w:space="0" w:color="0758E5"/>
         </w:tblBorders>
         <w:tblCellMar>
           <w:left w:w="144" w:type="dxa"/>
           <w:right w:w="144" w:type="dxa"/>
         </w:tblCellMar>
-        <w:tblInd w:w="164" w:type="dxa"/>
-        <w:tblW w:type="pct" w:w="100%"/>
+        <w:tblLook w:firstRow="0" w:lastRow="0" w:firstColumn="0" w:lastColumn="0" w:noHBand="0" w:noVBand="0" w:val="0000"/>
       </w:tblPr>
       <w:tr>
         <w:trPr>
@@ -33515,18 +32370,18 @@
                 <wp:inline>
                   <wp:extent cx="152400" cy="152400"/>
                   <wp:effectExtent b="0" l="0" r="0" t="0"/>
-                  <wp:docPr descr="" title="" id="151" name="Picture"/>
+                  <wp:docPr descr="" title="" id="150" name="Picture"/>
                   <a:graphic>
                     <a:graphicData uri="http://schemas.openxmlformats.org/drawingml/2006/picture">
                       <pic:pic>
                         <pic:nvPicPr>
-                          <pic:cNvPr descr="C:\Program Files\RStudio\resources\app\bin\quarto\share\formats\docx\note.png" id="152" name="Picture"/>
+                          <pic:cNvPr descr="C:\Program Files\RStudio\resources\app\bin\quarto\share\formats\docx\note.png" id="151" name="Picture"/>
                           <pic:cNvPicPr>
                             <a:picLocks noChangeArrowheads="1" noChangeAspect="1"/>
                           </pic:cNvPicPr>
                         </pic:nvPicPr>
                         <pic:blipFill>
-                          <a:blip r:embed="rId26"/>
+                          <a:blip r:embed="rId25"/>
                           <a:stretch>
                             <a:fillRect/>
                           </a:stretch>
@@ -33706,6 +32561,7 @@
               <w:t xml:space="preserve">errors are unbiased.</w:t>
             </w:r>
           </w:p>
+          <w:p/>
         </w:tc>
       </w:tr>
     </w:tbl>
@@ -33729,7 +32585,7 @@
         <w:t xml:space="preserve">the ordinal nature of the items and the estimated polychoric structure.</w:t>
       </w:r>
     </w:p>
-    <w:bookmarkStart w:id="153" w:name="define-cutoff-values"/>
+    <w:bookmarkStart w:id="152" w:name="define-cutoff-values"/>
     <w:p>
       <w:pPr>
         <w:pStyle w:val="Heading3"/>
@@ -33738,34 +32594,8 @@
         <w:t xml:space="preserve">10.1 Define Cutoff Values</w:t>
       </w:r>
     </w:p>
-    <w:p>
-      <w:pPr>
-        <w:pStyle w:val="FirstParagraph"/>
-      </w:pPr>
-      <w:r>
-        <w:rPr>
-          <w:vertAlign w:val="subscript"/>
-        </w:rPr>
-        <w:t xml:space="preserve">Source:</w:t>
-      </w:r>
-      <w:r>
-        <w:rPr>
-          <w:vertAlign w:val="subscript"/>
-        </w:rPr>
-        <w:t xml:space="preserve"> </w:t>
-      </w:r>
-      <w:hyperlink r:id="rId25">
-        <w:r>
-          <w:rPr>
-            <w:rStyle w:val="Hyperlink"/>
-            <w:vertAlign w:val="subscript"/>
-          </w:rPr>
-          <w:t xml:space="preserve">Article Notebook</w:t>
-        </w:r>
-      </w:hyperlink>
-    </w:p>
-    <w:bookmarkEnd w:id="153"/>
-    <w:bookmarkStart w:id="156" w:name="run-simulation"/>
+    <w:bookmarkEnd w:id="152"/>
+    <w:bookmarkStart w:id="155" w:name="run-simulation"/>
     <w:p>
       <w:pPr>
         <w:pStyle w:val="Heading3"/>
@@ -33779,17 +32609,16 @@
         <w:tblStyle w:val="Table"/>
         <w:tblLook w:firstRow="0" w:lastRow="0" w:firstColumn="0" w:lastColumn="0" w:noHBand="0" w:noVBand="0" w:val="0000"/>
         <w:tblBorders>
+          <w:top w:val="single" w:sz="4" w:space="0" w:color="EB9113"/>
           <w:left w:val="single" w:sz="24" w:space="0" w:color="EB9113"/>
+          <w:bottom w:val="single" w:sz="4" w:space="0" w:color="EB9113"/>
           <w:right w:val="single" w:sz="4" w:space="0" w:color="EB9113"/>
-          <w:top w:val="single" w:sz="4" w:space="0" w:color="EB9113"/>
-          <w:bottom w:val="single" w:sz="4" w:space="0" w:color="EB9113"/>
         </w:tblBorders>
         <w:tblCellMar>
           <w:left w:w="144" w:type="dxa"/>
           <w:right w:w="144" w:type="dxa"/>
         </w:tblCellMar>
-        <w:tblInd w:w="164" w:type="dxa"/>
-        <w:tblW w:type="pct" w:w="100%"/>
+        <w:tblLook w:firstRow="0" w:lastRow="0" w:firstColumn="0" w:lastColumn="0" w:noHBand="0" w:noVBand="0" w:val="0000"/>
       </w:tblPr>
       <w:tr>
         <w:trPr>
@@ -33816,18 +32645,18 @@
                 <wp:inline>
                   <wp:extent cx="152400" cy="152400"/>
                   <wp:effectExtent b="0" l="0" r="0" t="0"/>
-                  <wp:docPr descr="" title="" id="154" name="Picture"/>
+                  <wp:docPr descr="" title="" id="153" name="Picture"/>
                   <a:graphic>
                     <a:graphicData uri="http://schemas.openxmlformats.org/drawingml/2006/picture">
                       <pic:pic>
                         <pic:nvPicPr>
-                          <pic:cNvPr descr="C:\Program Files\RStudio\resources\app\bin\quarto\share\formats\docx\warning.png" id="155" name="Picture"/>
+                          <pic:cNvPr descr="C:\Program Files\RStudio\resources\app\bin\quarto\share\formats\docx\warning.png" id="154" name="Picture"/>
                           <pic:cNvPicPr>
                             <a:picLocks noChangeArrowheads="1" noChangeAspect="1"/>
                           </pic:cNvPicPr>
                         </pic:nvPicPr>
                         <pic:blipFill>
-                          <a:blip r:embed="rId57"/>
+                          <a:blip r:embed="rId56"/>
                           <a:stretch>
                             <a:fillRect/>
                           </a:stretch>
@@ -33905,11 +32734,12 @@
               <w:t xml:space="preserve">increase computation time proportionally.</w:t>
             </w:r>
           </w:p>
+          <w:p/>
         </w:tc>
       </w:tr>
     </w:tbl>
-    <w:bookmarkEnd w:id="156"/>
-    <w:bookmarkStart w:id="158" w:name="fit-index-cutoffs"/>
+    <w:bookmarkEnd w:id="155"/>
+    <w:bookmarkStart w:id="157" w:name="fit-index-cutoffs"/>
     <w:p>
       <w:pPr>
         <w:pStyle w:val="Heading3"/>
@@ -33957,13 +32787,13 @@
       <w:tr>
         <w:tc>
           <w:tcPr/>
-          <w:bookmarkStart w:id="157" w:name="tbl-cutoffs"/>
+          <w:bookmarkStart w:id="156" w:name="tbl-cutoffs"/>
           <w:p>
             <w:pPr>
               <w:jc w:val="center"/>
             </w:pPr>
             <w:pPr>
-              <w:jc w:val="start"/>
+              <w:jc w:val="left"/>
               <w:spacing w:before="200"/>
               <w:pStyle w:val="ImageCaption"/>
             </w:pPr>
@@ -34092,39 +32922,13 @@
               </w:tc>
             </w:tr>
           </w:tbl>
-          <w:bookmarkEnd w:id="157"/>
+          <w:bookmarkEnd w:id="156"/>
           <w:p/>
         </w:tc>
       </w:tr>
     </w:tbl>
-    <w:p>
-      <w:pPr>
-        <w:pStyle w:val="BodyText"/>
-      </w:pPr>
-      <w:r>
-        <w:rPr>
-          <w:vertAlign w:val="subscript"/>
-        </w:rPr>
-        <w:t xml:space="preserve">Source:</w:t>
-      </w:r>
-      <w:r>
-        <w:rPr>
-          <w:vertAlign w:val="subscript"/>
-        </w:rPr>
-        <w:t xml:space="preserve"> </w:t>
-      </w:r>
-      <w:hyperlink r:id="rId25">
-        <w:r>
-          <w:rPr>
-            <w:rStyle w:val="Hyperlink"/>
-            <w:vertAlign w:val="subscript"/>
-          </w:rPr>
-          <w:t xml:space="preserve">Article Notebook</w:t>
-        </w:r>
-      </w:hyperlink>
-    </w:p>
-    <w:bookmarkEnd w:id="158"/>
-    <w:bookmarkStart w:id="162" w:name="power-to-detect-misfit"/>
+    <w:bookmarkEnd w:id="157"/>
+    <w:bookmarkStart w:id="161" w:name="power-to-detect-misfit"/>
     <w:p>
       <w:pPr>
         <w:pStyle w:val="Heading3"/>
@@ -34177,13 +32981,13 @@
       <w:tr>
         <w:tc>
           <w:tcPr/>
-          <w:bookmarkStart w:id="159" w:name="tbl-power-fit"/>
+          <w:bookmarkStart w:id="158" w:name="tbl-power-fit"/>
           <w:p>
             <w:pPr>
               <w:jc w:val="center"/>
             </w:pPr>
             <w:pPr>
-              <w:jc w:val="start"/>
+              <w:jc w:val="left"/>
               <w:spacing w:before="200"/>
               <w:pStyle w:val="ImageCaption"/>
             </w:pPr>
@@ -34288,7 +33092,7 @@
               </w:tc>
             </w:tr>
           </w:tbl>
-          <w:bookmarkEnd w:id="159"/>
+          <w:bookmarkEnd w:id="158"/>
           <w:p/>
         </w:tc>
       </w:tr>
@@ -34298,32 +33102,6 @@
         <w:pStyle w:val="BodyText"/>
       </w:pPr>
       <w:r>
-        <w:rPr>
-          <w:vertAlign w:val="subscript"/>
-        </w:rPr>
-        <w:t xml:space="preserve">Source:</w:t>
-      </w:r>
-      <w:r>
-        <w:rPr>
-          <w:vertAlign w:val="subscript"/>
-        </w:rPr>
-        <w:t xml:space="preserve"> </w:t>
-      </w:r>
-      <w:hyperlink r:id="rId25">
-        <w:r>
-          <w:rPr>
-            <w:rStyle w:val="Hyperlink"/>
-            <w:vertAlign w:val="subscript"/>
-          </w:rPr>
-          <w:t xml:space="preserve">Article Notebook</w:t>
-        </w:r>
-      </w:hyperlink>
-    </w:p>
-    <w:p>
-      <w:pPr>
-        <w:pStyle w:val="BodyText"/>
-      </w:pPr>
-      <w:r>
         <w:t xml:space="preserve"> </w:t>
       </w:r>
     </w:p>
@@ -34332,17 +33110,16 @@
         <w:tblStyle w:val="Table"/>
         <w:tblLook w:firstRow="0" w:lastRow="0" w:firstColumn="0" w:lastColumn="0" w:noHBand="0" w:noVBand="0" w:val="0000"/>
         <w:tblBorders>
+          <w:top w:val="single" w:sz="4" w:space="0" w:color="00A047"/>
           <w:left w:val="single" w:sz="24" w:space="0" w:color="00A047"/>
+          <w:bottom w:val="single" w:sz="4" w:space="0" w:color="00A047"/>
           <w:right w:val="single" w:sz="4" w:space="0" w:color="00A047"/>
-          <w:top w:val="single" w:sz="4" w:space="0" w:color="00A047"/>
-          <w:bottom w:val="single" w:sz="4" w:space="0" w:color="00A047"/>
         </w:tblBorders>
         <w:tblCellMar>
           <w:left w:w="144" w:type="dxa"/>
           <w:right w:w="144" w:type="dxa"/>
         </w:tblCellMar>
-        <w:tblInd w:w="164" w:type="dxa"/>
-        <w:tblW w:type="pct" w:w="100%"/>
+        <w:tblLook w:firstRow="0" w:lastRow="0" w:firstColumn="0" w:lastColumn="0" w:noHBand="0" w:noVBand="0" w:val="0000"/>
       </w:tblPr>
       <w:tr>
         <w:trPr>
@@ -34369,18 +33146,18 @@
                 <wp:inline>
                   <wp:extent cx="152400" cy="152400"/>
                   <wp:effectExtent b="0" l="0" r="0" t="0"/>
-                  <wp:docPr descr="" title="" id="160" name="Picture"/>
+                  <wp:docPr descr="" title="" id="159" name="Picture"/>
                   <a:graphic>
                     <a:graphicData uri="http://schemas.openxmlformats.org/drawingml/2006/picture">
                       <pic:pic>
                         <pic:nvPicPr>
-                          <pic:cNvPr descr="C:\Program Files\RStudio\resources\app\bin\quarto\share\formats\docx\tip.png" id="161" name="Picture"/>
+                          <pic:cNvPr descr="C:\Program Files\RStudio\resources\app\bin\quarto\share\formats\docx\tip.png" id="160" name="Picture"/>
                           <pic:cNvPicPr>
                             <a:picLocks noChangeArrowheads="1" noChangeAspect="1"/>
                           </pic:cNvPicPr>
                         </pic:nvPicPr>
                         <pic:blipFill>
-                          <a:blip r:embed="rId50"/>
+                          <a:blip r:embed="rId49"/>
                           <a:stretch>
                             <a:fillRect/>
                           </a:stretch>
@@ -34481,11 +33258,12 @@
               <w:t xml:space="preserve">exceed cutoffs (i.e., the cutoffs are too strict for our model and N).</w:t>
             </w:r>
           </w:p>
+          <w:p/>
         </w:tc>
       </w:tr>
     </w:tbl>
-    <w:bookmarkEnd w:id="162"/>
-    <w:bookmarkStart w:id="173" w:name="sampling-distributions-of-fit-indices"/>
+    <w:bookmarkEnd w:id="161"/>
+    <w:bookmarkStart w:id="172" w:name="sampling-distributions-of-fit-indices"/>
     <w:p>
       <w:pPr>
         <w:pStyle w:val="Heading3"/>
@@ -34531,7 +33309,7 @@
         <w:t xml:space="preserve">the cutoffs.</w:t>
       </w:r>
     </w:p>
-    <w:bookmarkStart w:id="167" w:name="cell-fig-power-fit"/>
+    <w:bookmarkStart w:id="166" w:name="cell-fig-power-fit"/>
     <w:tbl>
       <w:tblPr>
         <w:tblStyle w:val="Table"/>
@@ -34545,7 +33323,7 @@
       <w:tr>
         <w:tc>
           <w:tcPr/>
-          <w:bookmarkStart w:id="166" w:name="fig-power-fit"/>
+          <w:bookmarkStart w:id="165" w:name="fig-power-fit"/>
           <w:p>
             <w:pPr>
               <w:pStyle w:val="Compact"/>
@@ -34556,18 +33334,18 @@
                 <wp:inline>
                   <wp:extent cx="5334000" cy="2133600"/>
                   <wp:effectExtent b="0" l="0" r="0" t="0"/>
-                  <wp:docPr descr="" title="" id="164" name="Picture"/>
+                  <wp:docPr descr="" title="" id="163" name="Picture"/>
                   <a:graphic>
                     <a:graphicData uri="http://schemas.openxmlformats.org/drawingml/2006/picture">
                       <pic:pic>
                         <pic:nvPicPr>
-                          <pic:cNvPr descr="index_files/figure-docx/fig-power-fit-1.png" id="165" name="Picture"/>
+                          <pic:cNvPr descr="index_files/figure-docx/fig-power-fit-1.png" id="164" name="Picture"/>
                           <pic:cNvPicPr>
                             <a:picLocks noChangeArrowheads="1" noChangeAspect="1"/>
                           </pic:cNvPicPr>
                         </pic:nvPicPr>
                         <pic:blipFill>
-                          <a:blip r:embed="rId163"/>
+                          <a:blip r:embed="rId162"/>
                           <a:stretch>
                             <a:fillRect/>
                           </a:stretch>
@@ -34599,7 +33377,7 @@
               <w:jc w:val="center"/>
             </w:pPr>
             <w:pPr>
-              <w:jc w:val="start"/>
+              <w:jc w:val="left"/>
               <w:spacing w:before="200"/>
               <w:pStyle w:val="ImageCaption"/>
             </w:pPr>
@@ -34607,37 +33385,11 @@
               <w:t xml:space="preserve">Figure 9: Sampling distributions of fit indices — Power of rejecting misspecified models</w:t>
             </w:r>
           </w:p>
-          <w:bookmarkEnd w:id="166"/>
+          <w:bookmarkEnd w:id="165"/>
         </w:tc>
       </w:tr>
     </w:tbl>
-    <w:p>
-      <w:pPr>
-        <w:pStyle w:val="BodyText"/>
-      </w:pPr>
-      <w:r>
-        <w:rPr>
-          <w:vertAlign w:val="subscript"/>
-        </w:rPr>
-        <w:t xml:space="preserve">Source:</w:t>
-      </w:r>
-      <w:r>
-        <w:rPr>
-          <w:vertAlign w:val="subscript"/>
-        </w:rPr>
-        <w:t xml:space="preserve"> </w:t>
-      </w:r>
-      <w:hyperlink r:id="rId25">
-        <w:r>
-          <w:rPr>
-            <w:rStyle w:val="Hyperlink"/>
-            <w:vertAlign w:val="subscript"/>
-          </w:rPr>
-          <w:t xml:space="preserve">Article Notebook</w:t>
-        </w:r>
-      </w:hyperlink>
-    </w:p>
-    <w:bookmarkEnd w:id="167"/>
+    <w:bookmarkEnd w:id="166"/>
     <w:p>
       <w:pPr>
         <w:pStyle w:val="BodyText"/>
@@ -34663,7 +33415,7 @@
         <w:t xml:space="preserve">at α = .05. The shaded areas represent the rejection regions.</w:t>
       </w:r>
     </w:p>
-    <w:bookmarkStart w:id="172" w:name="cell-fig-cutoff-plot"/>
+    <w:bookmarkStart w:id="171" w:name="cell-fig-cutoff-plot"/>
     <w:tbl>
       <w:tblPr>
         <w:tblStyle w:val="Table"/>
@@ -34677,7 +33429,7 @@
       <w:tr>
         <w:tc>
           <w:tcPr/>
-          <w:bookmarkStart w:id="171" w:name="fig-cutoff-plot"/>
+          <w:bookmarkStart w:id="170" w:name="fig-cutoff-plot"/>
           <w:p>
             <w:pPr>
               <w:pStyle w:val="Compact"/>
@@ -34688,18 +33440,18 @@
                 <wp:inline>
                   <wp:extent cx="5334000" cy="2133600"/>
                   <wp:effectExtent b="0" l="0" r="0" t="0"/>
-                  <wp:docPr descr="" title="" id="169" name="Picture"/>
+                  <wp:docPr descr="" title="" id="168" name="Picture"/>
                   <a:graphic>
                     <a:graphicData uri="http://schemas.openxmlformats.org/drawingml/2006/picture">
                       <pic:pic>
                         <pic:nvPicPr>
-                          <pic:cNvPr descr="index_files/figure-docx/fig-cutoff-plot-1.png" id="170" name="Picture"/>
+                          <pic:cNvPr descr="index_files/figure-docx/fig-cutoff-plot-1.png" id="169" name="Picture"/>
                           <pic:cNvPicPr>
                             <a:picLocks noChangeArrowheads="1" noChangeAspect="1"/>
                           </pic:cNvPicPr>
                         </pic:nvPicPr>
                         <pic:blipFill>
-                          <a:blip r:embed="rId168"/>
+                          <a:blip r:embed="rId167"/>
                           <a:stretch>
                             <a:fillRect/>
                           </a:stretch>
@@ -34731,7 +33483,7 @@
               <w:jc w:val="center"/>
             </w:pPr>
             <w:pPr>
-              <w:jc w:val="start"/>
+              <w:jc w:val="left"/>
               <w:spacing w:before="200"/>
               <w:pStyle w:val="ImageCaption"/>
             </w:pPr>
@@ -34739,39 +33491,13 @@
               <w:t xml:space="preserve">Figure 10: Sampling distributions of fit indices with simulation-based cutoffs at alpha = 0.05</w:t>
             </w:r>
           </w:p>
-          <w:bookmarkEnd w:id="171"/>
+          <w:bookmarkEnd w:id="170"/>
         </w:tc>
       </w:tr>
     </w:tbl>
-    <w:p>
-      <w:pPr>
-        <w:pStyle w:val="BodyText"/>
-      </w:pPr>
-      <w:r>
-        <w:rPr>
-          <w:vertAlign w:val="subscript"/>
-        </w:rPr>
-        <w:t xml:space="preserve">Source:</w:t>
-      </w:r>
-      <w:r>
-        <w:rPr>
-          <w:vertAlign w:val="subscript"/>
-        </w:rPr>
-        <w:t xml:space="preserve"> </w:t>
-      </w:r>
-      <w:hyperlink r:id="rId25">
-        <w:r>
-          <w:rPr>
-            <w:rStyle w:val="Hyperlink"/>
-            <w:vertAlign w:val="subscript"/>
-          </w:rPr>
-          <w:t xml:space="preserve">Article Notebook</w:t>
-        </w:r>
-      </w:hyperlink>
-    </w:p>
+    <w:bookmarkEnd w:id="171"/>
     <w:bookmarkEnd w:id="172"/>
-    <w:bookmarkEnd w:id="173"/>
-    <w:bookmarkStart w:id="177" w:name="detailed-parameter-summary"/>
+    <w:bookmarkStart w:id="176" w:name="detailed-parameter-summary"/>
     <w:p>
       <w:pPr>
         <w:pStyle w:val="Heading3"/>
@@ -34801,13 +33527,13 @@
       <w:tr>
         <w:tc>
           <w:tcPr/>
-          <w:bookmarkStart w:id="174" w:name="tbl-simulation-performance"/>
+          <w:bookmarkStart w:id="173" w:name="tbl-simulation-performance"/>
           <w:p>
             <w:pPr>
               <w:jc w:val="center"/>
             </w:pPr>
             <w:pPr>
-              <w:jc w:val="start"/>
+              <w:jc w:val="left"/>
               <w:spacing w:before="200"/>
               <w:pStyle w:val="ImageCaption"/>
             </w:pPr>
@@ -36909,7 +35635,7 @@
               </w:tc>
             </w:tr>
           </w:tbl>
-          <w:bookmarkEnd w:id="174"/>
+          <w:bookmarkEnd w:id="173"/>
           <w:p/>
         </w:tc>
       </w:tr>
@@ -36919,32 +35645,6 @@
         <w:pStyle w:val="BodyText"/>
       </w:pPr>
       <w:r>
-        <w:rPr>
-          <w:vertAlign w:val="subscript"/>
-        </w:rPr>
-        <w:t xml:space="preserve">Source:</w:t>
-      </w:r>
-      <w:r>
-        <w:rPr>
-          <w:vertAlign w:val="subscript"/>
-        </w:rPr>
-        <w:t xml:space="preserve"> </w:t>
-      </w:r>
-      <w:hyperlink r:id="rId25">
-        <w:r>
-          <w:rPr>
-            <w:rStyle w:val="Hyperlink"/>
-            <w:vertAlign w:val="subscript"/>
-          </w:rPr>
-          <w:t xml:space="preserve">Article Notebook</w:t>
-        </w:r>
-      </w:hyperlink>
-    </w:p>
-    <w:p>
-      <w:pPr>
-        <w:pStyle w:val="BodyText"/>
-      </w:pPr>
-      <w:r>
         <w:t xml:space="preserve">Only few threshold parameters show power below .80 (see full report), and thresholds are generally</w:t>
       </w:r>
       <w:r>
@@ -36971,17 +35671,16 @@
         <w:tblStyle w:val="Table"/>
         <w:tblLook w:firstRow="0" w:lastRow="0" w:firstColumn="0" w:lastColumn="0" w:noHBand="0" w:noVBand="0" w:val="0000"/>
         <w:tblBorders>
+          <w:top w:val="single" w:sz="4" w:space="0" w:color="00A047"/>
           <w:left w:val="single" w:sz="24" w:space="0" w:color="00A047"/>
+          <w:bottom w:val="single" w:sz="4" w:space="0" w:color="00A047"/>
           <w:right w:val="single" w:sz="4" w:space="0" w:color="00A047"/>
-          <w:top w:val="single" w:sz="4" w:space="0" w:color="00A047"/>
-          <w:bottom w:val="single" w:sz="4" w:space="0" w:color="00A047"/>
         </w:tblBorders>
         <w:tblCellMar>
           <w:left w:w="144" w:type="dxa"/>
           <w:right w:w="144" w:type="dxa"/>
         </w:tblCellMar>
-        <w:tblInd w:w="164" w:type="dxa"/>
-        <w:tblW w:type="pct" w:w="100%"/>
+        <w:tblLook w:firstRow="0" w:lastRow="0" w:firstColumn="0" w:lastColumn="0" w:noHBand="0" w:noVBand="0" w:val="0000"/>
       </w:tblPr>
       <w:tr>
         <w:trPr>
@@ -37008,18 +35707,18 @@
                 <wp:inline>
                   <wp:extent cx="152400" cy="152400"/>
                   <wp:effectExtent b="0" l="0" r="0" t="0"/>
-                  <wp:docPr descr="" title="" id="175" name="Picture"/>
+                  <wp:docPr descr="" title="" id="174" name="Picture"/>
                   <a:graphic>
                     <a:graphicData uri="http://schemas.openxmlformats.org/drawingml/2006/picture">
                       <pic:pic>
                         <pic:nvPicPr>
-                          <pic:cNvPr descr="C:\Program Files\RStudio\resources\app\bin\quarto\share\formats\docx\tip.png" id="176" name="Picture"/>
+                          <pic:cNvPr descr="C:\Program Files\RStudio\resources\app\bin\quarto\share\formats\docx\tip.png" id="175" name="Picture"/>
                           <pic:cNvPicPr>
                             <a:picLocks noChangeArrowheads="1" noChangeAspect="1"/>
                           </pic:cNvPicPr>
                         </pic:nvPicPr>
                         <pic:blipFill>
-                          <a:blip r:embed="rId50"/>
+                          <a:blip r:embed="rId49"/>
                           <a:stretch>
                             <a:fillRect/>
                           </a:stretch>
@@ -37229,6 +35928,7 @@
               <w:t xml:space="preserve">factor correlations, and residual variances.</w:t>
             </w:r>
           </w:p>
+          <w:p/>
         </w:tc>
       </w:tr>
     </w:tbl>
@@ -37264,9 +35964,9 @@
         <w:t xml:space="preserve">the CFA results presented throughout this tutorial.</w:t>
       </w:r>
     </w:p>
+    <w:bookmarkEnd w:id="176"/>
     <w:bookmarkEnd w:id="177"/>
-    <w:bookmarkEnd w:id="178"/>
-    <w:bookmarkStart w:id="184" w:name="sec-conclusions"/>
+    <w:bookmarkStart w:id="183" w:name="sec-conclusions"/>
     <w:p>
       <w:pPr>
         <w:pStyle w:val="Heading2"/>
@@ -37619,17 +36319,16 @@
         <w:tblStyle w:val="Table"/>
         <w:tblLook w:firstRow="0" w:lastRow="0" w:firstColumn="0" w:lastColumn="0" w:noHBand="0" w:noVBand="0" w:val="0000"/>
         <w:tblBorders>
+          <w:top w:val="single" w:sz="4" w:space="0" w:color="CC1914"/>
           <w:left w:val="single" w:sz="24" w:space="0" w:color="CC1914"/>
+          <w:bottom w:val="single" w:sz="4" w:space="0" w:color="CC1914"/>
           <w:right w:val="single" w:sz="4" w:space="0" w:color="CC1914"/>
-          <w:top w:val="single" w:sz="4" w:space="0" w:color="CC1914"/>
-          <w:bottom w:val="single" w:sz="4" w:space="0" w:color="CC1914"/>
         </w:tblBorders>
         <w:tblCellMar>
           <w:left w:w="144" w:type="dxa"/>
           <w:right w:w="144" w:type="dxa"/>
         </w:tblCellMar>
-        <w:tblInd w:w="164" w:type="dxa"/>
-        <w:tblW w:type="pct" w:w="100%"/>
+        <w:tblLook w:firstRow="0" w:lastRow="0" w:firstColumn="0" w:lastColumn="0" w:noHBand="0" w:noVBand="0" w:val="0000"/>
       </w:tblPr>
       <w:tr>
         <w:trPr>
@@ -37656,12 +36355,12 @@
                 <wp:inline>
                   <wp:extent cx="152400" cy="152400"/>
                   <wp:effectExtent b="0" l="0" r="0" t="0"/>
-                  <wp:docPr descr="" title="" id="179" name="Picture"/>
+                  <wp:docPr descr="" title="" id="178" name="Picture"/>
                   <a:graphic>
                     <a:graphicData uri="http://schemas.openxmlformats.org/drawingml/2006/picture">
                       <pic:pic>
                         <pic:nvPicPr>
-                          <pic:cNvPr descr="C:\Program Files\RStudio\resources\app\bin\quarto\share\formats\docx\important.png" id="180" name="Picture"/>
+                          <pic:cNvPr descr="C:\Program Files\RStudio\resources\app\bin\quarto\share\formats\docx\important.png" id="179" name="Picture"/>
                           <pic:cNvPicPr>
                             <a:picLocks noChangeArrowheads="1" noChangeAspect="1"/>
                           </pic:cNvPicPr>
@@ -37946,6 +36645,7 @@
               <w:t xml:space="preserve">justified changes, and be alert to items that appear repeatedly in high MIs</w:t>
             </w:r>
           </w:p>
+          <w:p/>
         </w:tc>
       </w:tr>
     </w:tbl>
@@ -37965,7 +36665,7 @@
       <w:r>
         <w:t xml:space="preserve"> </w:t>
       </w:r>
-      <w:hyperlink r:id="rId181">
+      <w:hyperlink r:id="rId180">
         <w:r>
           <w:rPr>
             <w:rStyle w:val="Hyperlink"/>
@@ -37988,7 +36688,7 @@
       <w:r>
         <w:t xml:space="preserve"> </w:t>
       </w:r>
-      <w:hyperlink r:id="rId182">
+      <w:hyperlink r:id="rId181">
         <w:r>
           <w:rPr>
             <w:rStyle w:val="Hyperlink"/>
@@ -38002,7 +36702,7 @@
       <w:r>
         <w:t xml:space="preserve"> </w:t>
       </w:r>
-      <w:hyperlink r:id="rId183">
+      <w:hyperlink r:id="rId182">
         <w:r>
           <w:rPr>
             <w:rStyle w:val="Hyperlink"/>
@@ -38011,8 +36711,8 @@
         </w:r>
       </w:hyperlink>
     </w:p>
-    <w:bookmarkEnd w:id="184"/>
-    <w:bookmarkStart w:id="196" w:name="references"/>
+    <w:bookmarkEnd w:id="183"/>
+    <w:bookmarkStart w:id="195" w:name="references"/>
     <w:p>
       <w:pPr>
         <w:pStyle w:val="Heading2"/>
@@ -38021,8 +36721,8 @@
         <w:t xml:space="preserve">References</w:t>
       </w:r>
     </w:p>
-    <w:bookmarkStart w:id="195" w:name="refs"/>
-    <w:bookmarkStart w:id="186" w:name="ref-lin2022"/>
+    <w:bookmarkStart w:id="194" w:name="refs"/>
+    <w:bookmarkStart w:id="185" w:name="ref-lin2022"/>
     <w:p>
       <w:pPr>
         <w:pStyle w:val="Bibliography"/>
@@ -38071,7 +36771,7 @@
       <w:r>
         <w:t xml:space="preserve"> </w:t>
       </w:r>
-      <w:hyperlink r:id="rId185">
+      <w:hyperlink r:id="rId184">
         <w:r>
           <w:rPr>
             <w:rStyle w:val="Hyperlink"/>
@@ -38080,8 +36780,8 @@
         </w:r>
       </w:hyperlink>
     </w:p>
-    <w:bookmarkEnd w:id="186"/>
-    <w:bookmarkStart w:id="188" w:name="ref-mcneish2023likert"/>
+    <w:bookmarkEnd w:id="185"/>
+    <w:bookmarkStart w:id="187" w:name="ref-mcneish2023likert"/>
     <w:p>
       <w:pPr>
         <w:pStyle w:val="Bibliography"/>
@@ -38156,7 +36856,7 @@
       <w:r>
         <w:t xml:space="preserve"> </w:t>
       </w:r>
-      <w:hyperlink r:id="rId187">
+      <w:hyperlink r:id="rId186">
         <w:r>
           <w:rPr>
             <w:rStyle w:val="Hyperlink"/>
@@ -38165,8 +36865,8 @@
         </w:r>
       </w:hyperlink>
     </w:p>
-    <w:bookmarkEnd w:id="188"/>
-    <w:bookmarkStart w:id="190" w:name="ref-rogers2021"/>
+    <w:bookmarkEnd w:id="187"/>
+    <w:bookmarkStart w:id="189" w:name="ref-rogers2021"/>
     <w:p>
       <w:pPr>
         <w:pStyle w:val="Bibliography"/>
@@ -38217,7 +36917,7 @@
       <w:r>
         <w:t xml:space="preserve"> </w:t>
       </w:r>
-      <w:hyperlink r:id="rId189">
+      <w:hyperlink r:id="rId188">
         <w:r>
           <w:rPr>
             <w:rStyle w:val="Hyperlink"/>
@@ -38226,8 +36926,8 @@
         </w:r>
       </w:hyperlink>
     </w:p>
-    <w:bookmarkEnd w:id="190"/>
-    <w:bookmarkStart w:id="192" w:name="ref-rogers2022"/>
+    <w:bookmarkEnd w:id="189"/>
+    <w:bookmarkStart w:id="191" w:name="ref-rogers2022"/>
     <w:p>
       <w:pPr>
         <w:pStyle w:val="Bibliography"/>
@@ -38294,7 +36994,7 @@
       <w:r>
         <w:t xml:space="preserve"> </w:t>
       </w:r>
-      <w:hyperlink r:id="rId191">
+      <w:hyperlink r:id="rId190">
         <w:r>
           <w:rPr>
             <w:rStyle w:val="Hyperlink"/>
@@ -38303,8 +37003,8 @@
         </w:r>
       </w:hyperlink>
     </w:p>
-    <w:bookmarkEnd w:id="192"/>
-    <w:bookmarkStart w:id="194" w:name="ref-rogers2024"/>
+    <w:bookmarkEnd w:id="191"/>
+    <w:bookmarkStart w:id="193" w:name="ref-rogers2024"/>
     <w:p>
       <w:pPr>
         <w:pStyle w:val="Bibliography"/>
@@ -38340,7 +37040,7 @@
       <w:r>
         <w:t xml:space="preserve"> </w:t>
       </w:r>
-      <w:hyperlink r:id="rId193">
+      <w:hyperlink r:id="rId192">
         <w:r>
           <w:rPr>
             <w:rStyle w:val="Hyperlink"/>
@@ -38349,10 +37049,14 @@
         </w:r>
       </w:hyperlink>
     </w:p>
+    <w:bookmarkEnd w:id="193"/>
     <w:bookmarkEnd w:id="194"/>
     <w:bookmarkEnd w:id="195"/>
-    <w:bookmarkEnd w:id="196"/>
-    <w:sectPr/>
+    <w:sectPr>
+      <w:footnotePr>
+        <w:numRestart w:val="eachSect"/>
+      </w:footnotePr>
+    </w:sectPr>
   </w:body>
 </w:document>
 </file>
@@ -38902,8 +37606,6 @@
     </w:pPr>
     <w:rPr>
       <w:rFonts w:asciiTheme="majorHAnsi" w:cstheme="majorBidi" w:eastAsiaTheme="majorEastAsia" w:hAnsiTheme="majorHAnsi"/>
-      <w:spacing w:val="-10"/>
-      <w:kern w:val="28"/>
       <w:sz w:val="56"/>
       <w:szCs w:val="56"/>
     </w:rPr>
@@ -38916,8 +37618,6 @@
     <w:rsid w:val="00A10FD9"/>
     <w:rPr>
       <w:rFonts w:asciiTheme="majorHAnsi" w:cstheme="majorBidi" w:eastAsiaTheme="majorEastAsia" w:hAnsiTheme="majorHAnsi"/>
-      <w:spacing w:val="-10"/>
-      <w:kern w:val="28"/>
       <w:sz w:val="56"/>
       <w:szCs w:val="56"/>
     </w:rPr>
@@ -38958,23 +37658,31 @@
   </w:style>
   <w:style w:customStyle="1" w:styleId="Author" w:type="paragraph">
     <w:name w:val="Author"/>
+    <w:basedOn w:val="Title"/>
     <w:next w:val="BodyText"/>
     <w:qFormat/>
     <w:pPr>
       <w:keepNext/>
       <w:keepLines/>
-      <w:jc w:val="center"/>
     </w:pPr>
+    <w:rPr>
+      <w:sz w:val="24"/>
+      <w:szCs w:val="24"/>
+    </w:rPr>
   </w:style>
   <w:style w:styleId="Date" w:type="paragraph">
     <w:name w:val="Date"/>
+    <w:basedOn w:val="Title"/>
     <w:next w:val="BodyText"/>
     <w:qFormat/>
     <w:pPr>
       <w:keepNext/>
       <w:keepLines/>
-      <w:jc w:val="center"/>
     </w:pPr>
+    <w:rPr>
+      <w:sz w:val="24"/>
+      <w:szCs w:val="24"/>
+    </w:rPr>
   </w:style>
   <w:style w:customStyle="1" w:styleId="AbstractTitle" w:type="paragraph">
     <w:name w:val="Abstract Title"/>

</xml_diff>